<commit_message>
Add explicit unsigned-PE finding table (config/GUI/tssGUI-icons.dll)
Named the one unsigned binary out of 115 PE files directly in the
report body with its section layout and SHA-256, rather than leaving
it as prose only.

Co-Authored-By: Claude Sonnet 5 <noreply@anthropic.com>
Claude-Session: https://claude.ai/code/session_01MjYQcxWWR9pJZN5XKi6Ebx
</commit_message>
<xml_diff>
--- a/TSS_Security_Review.docx
+++ b/TSS_Security_Review.docx
@@ -524,8 +524,151 @@
       </w:r>
     </w:p>
     <w:p>
+      <w:pPr>
+        <w:pStyle w:val="Heading3"/>
+      </w:pPr>
       <w:r>
-        <w:t>The single unsigned PE file, config/GUI/tssGUI-icons.dll, was inspected: it contains only .rdata and .rsrc sections (no .text/code section), i.e. it is a resource-only icon library for the GUI with no executable code. This is a common, low-risk pattern and does not indicate tampering.</w:t>
+        <w:t>3.4.1 Unsigned PE finding</w:t>
+      </w:r>
+    </w:p>
+    <w:tbl>
+      <w:tblPr>
+        <w:tblStyle w:val="LightGrid-Accent1"/>
+        <w:tblW w:type="auto" w:w="0"/>
+        <w:tblLook w:firstColumn="1" w:firstRow="1" w:lastColumn="0" w:lastRow="0" w:noHBand="0" w:noVBand="1" w:val="04A0"/>
+      </w:tblPr>
+      <w:tblGrid>
+        <w:gridCol w:w="2160"/>
+        <w:gridCol w:w="2160"/>
+        <w:gridCol w:w="2160"/>
+        <w:gridCol w:w="2160"/>
+      </w:tblGrid>
+      <w:tr>
+        <w:tc>
+          <w:tcPr>
+            <w:tcW w:type="dxa" w:w="2160"/>
+          </w:tcPr>
+          <w:p>
+            <w:r>
+              <w:t>Path</w:t>
+            </w:r>
+          </w:p>
+        </w:tc>
+        <w:tc>
+          <w:tcPr>
+            <w:tcW w:type="dxa" w:w="2160"/>
+          </w:tcPr>
+          <w:p>
+            <w:r>
+              <w:t>Signed</w:t>
+            </w:r>
+          </w:p>
+        </w:tc>
+        <w:tc>
+          <w:tcPr>
+            <w:tcW w:type="dxa" w:w="2160"/>
+          </w:tcPr>
+          <w:p>
+            <w:r>
+              <w:t>PE Sections</w:t>
+            </w:r>
+          </w:p>
+        </w:tc>
+        <w:tc>
+          <w:tcPr>
+            <w:tcW w:type="dxa" w:w="2160"/>
+          </w:tcPr>
+          <w:p>
+            <w:r>
+              <w:t>Assessment</w:t>
+            </w:r>
+          </w:p>
+        </w:tc>
+      </w:tr>
+      <w:tr>
+        <w:tc>
+          <w:tcPr>
+            <w:tcW w:type="dxa" w:w="2160"/>
+          </w:tcPr>
+          <w:p>
+            <w:r>
+              <w:t>config/GUI/tssGUI-icons.dll</w:t>
+            </w:r>
+          </w:p>
+        </w:tc>
+        <w:tc>
+          <w:tcPr>
+            <w:tcW w:type="dxa" w:w="2160"/>
+          </w:tcPr>
+          <w:p>
+            <w:r>
+              <w:t>No</w:t>
+            </w:r>
+          </w:p>
+        </w:tc>
+        <w:tc>
+          <w:tcPr>
+            <w:tcW w:type="dxa" w:w="2160"/>
+          </w:tcPr>
+          <w:p>
+            <w:r>
+              <w:t>.rdata, .rsrc (no .text/code section)</w:t>
+            </w:r>
+          </w:p>
+        </w:tc>
+        <w:tc>
+          <w:tcPr>
+            <w:tcW w:type="dxa" w:w="2160"/>
+          </w:tcPr>
+          <w:p>
+            <w:r>
+              <w:t>Resource-only icon library for the TSSGUI front-end; contains no executable code. Unsigned status is expected/normal for this file type and is not an indicator of tampering.</w:t>
+            </w:r>
+          </w:p>
+        </w:tc>
+      </w:tr>
+      <w:tr>
+        <w:tc>
+          <w:tcPr>
+            <w:tcW w:type="dxa" w:w="2160"/>
+          </w:tcPr>
+          <w:p>
+            <w:r>
+              <w:t>SHA-256</w:t>
+            </w:r>
+          </w:p>
+        </w:tc>
+        <w:tc>
+          <w:tcPr>
+            <w:tcW w:type="dxa" w:w="2160"/>
+          </w:tcPr>
+          <w:p>
+            <w:r/>
+          </w:p>
+        </w:tc>
+        <w:tc>
+          <w:tcPr>
+            <w:tcW w:type="dxa" w:w="2160"/>
+          </w:tcPr>
+          <w:p>
+            <w:r/>
+          </w:p>
+        </w:tc>
+        <w:tc>
+          <w:tcPr>
+            <w:tcW w:type="dxa" w:w="2160"/>
+          </w:tcPr>
+          <w:p>
+            <w:r>
+              <w:t>335ff1bb62b2fd5b5f7c0d5502a72e8bc9e4b7b178a0aa60a55a2415670f30ee</w:t>
+            </w:r>
+          </w:p>
+        </w:tc>
+      </w:tr>
+    </w:tbl>
+    <w:p>
+      <w:r>
+        <w:t>This is the only unsigned PE binary out of 115 found in the archive (114/115 signed). It was manually inspected and contains only .rdata and .rsrc sections — no .text/code section — confirming it is a resource-only icon library for the GUI, not a functional executable or DLL. This is a common, low-risk pattern and does not indicate tampering.</w:t>
       </w:r>
     </w:p>
     <w:p>

</xml_diff>

<commit_message>
Add weak-link analysis for unsigned tssGUI-icons.dll (section 3.4.2)
Traced the actual TSSGUI.ps1 call site (Shell32!ExtractIconEx, resource-only
load, no DllMain execution) rather than reasoning from file properties
alone, to determine whether the unsigned DLL could compromise the broader
toolkit. Conclusion: no live code-execution path today, but it remains the
one file lacking Authenticode tamper-evidence.

Co-Authored-By: Claude Sonnet 5 <noreply@anthropic.com>
Claude-Session: https://claude.ai/code/session_01MjYQcxWWR9pJZN5XKi6Ebx
</commit_message>
<xml_diff>
--- a/TSS_Security_Review.docx
+++ b/TSS_Security_Review.docx
@@ -678,6 +678,172 @@
     </w:p>
     <w:p>
       <w:pPr>
+        <w:pStyle w:val="Heading3"/>
+      </w:pPr>
+      <w:r>
+        <w:t>3.4.2 Weak-link analysis: could the unsigned DLL compromise the solution?</w:t>
+      </w:r>
+    </w:p>
+    <w:p>
+      <w:r>
+        <w:t>Question examined: since config/GUI/tssGUI-icons.dll is the one unsigned PE in the archive, could it serve as the weakest link and lead to compromise of the broader toolkit? Verified against the actual call site in TSSGUI.ps1 rather than the file's properties alone.</w:t>
+      </w:r>
+    </w:p>
+    <w:p>
+      <w:r>
+        <w:t>TSSGUI.ps1 loads the file exclusively via a P/Invoke call to Shell32!ExtractIconEx (line ~230-249): [System.IconExtractor]::Extract("$tssGuiPath\config\GUI\tssGUI-icons.dll", $i, $true). This is the same Win32 API Windows Explorer uses to render file-type icons for arbitrary, untrusted files. It loads the target strictly as an image resource (LOAD_LIBRARY_AS_IMAGE_RESOURCE semantics) and does not invoke DllMain or execute any code the file might contain — consistent with the file having no .text section to execute in the first place. The path is also hardcoded/explicit rather than resolved via DLL search order, so classic DLL search-order hijacking does not apply.</w:t>
+      </w:r>
+    </w:p>
+    <w:tbl>
+      <w:tblPr>
+        <w:tblStyle w:val="LightGrid-Accent1"/>
+        <w:tblW w:type="auto" w:w="0"/>
+        <w:tblLook w:firstColumn="1" w:firstRow="1" w:lastColumn="0" w:lastRow="0" w:noHBand="0" w:noVBand="1" w:val="04A0"/>
+      </w:tblPr>
+      <w:tblGrid>
+        <w:gridCol w:w="4320"/>
+        <w:gridCol w:w="4320"/>
+      </w:tblGrid>
+      <w:tr>
+        <w:tc>
+          <w:tcPr>
+            <w:tcW w:type="dxa" w:w="4320"/>
+          </w:tcPr>
+          <w:p>
+            <w:r>
+              <w:t>Angle</w:t>
+            </w:r>
+          </w:p>
+        </w:tc>
+        <w:tc>
+          <w:tcPr>
+            <w:tcW w:type="dxa" w:w="4320"/>
+          </w:tcPr>
+          <w:p>
+            <w:r>
+              <w:t>Verdict</w:t>
+            </w:r>
+          </w:p>
+        </w:tc>
+      </w:tr>
+      <w:tr>
+        <w:tc>
+          <w:tcPr>
+            <w:tcW w:type="dxa" w:w="4320"/>
+          </w:tcPr>
+          <w:p>
+            <w:r>
+              <w:t>Code execution via current call site</w:t>
+            </w:r>
+          </w:p>
+        </w:tc>
+        <w:tc>
+          <w:tcPr>
+            <w:tcW w:type="dxa" w:w="4320"/>
+          </w:tcPr>
+          <w:p>
+            <w:r>
+              <w:t>No — icon extraction does not execute module code by design; this is why icon previews are considered safe for untrusted files.</w:t>
+            </w:r>
+          </w:p>
+        </w:tc>
+      </w:tr>
+      <w:tr>
+        <w:tc>
+          <w:tcPr>
+            <w:tcW w:type="dxa" w:w="4320"/>
+          </w:tcPr>
+          <w:p>
+            <w:r>
+              <w:t>Integrity / tamper-detection</w:t>
+            </w:r>
+          </w:p>
+        </w:tc>
+        <w:tc>
+          <w:tcPr>
+            <w:tcW w:type="dxa" w:w="4320"/>
+          </w:tcPr>
+          <w:p>
+            <w:r>
+              <w:t>Yes, this is the real gap: it is the only file in the archive where Authenticode/WDAC give no cryptographic assurance the bytes are unmodified. Every other binary would fail signature validation if swapped; this one would not.</w:t>
+            </w:r>
+          </w:p>
+        </w:tc>
+      </w:tr>
+      <w:tr>
+        <w:tc>
+          <w:tcPr>
+            <w:tcW w:type="dxa" w:w="4320"/>
+          </w:tcPr>
+          <w:p>
+            <w:r>
+              <w:t>Resource-parser exploitation</w:t>
+            </w:r>
+          </w:p>
+        </w:tc>
+        <w:tc>
+          <w:tcPr>
+            <w:tcW w:type="dxa" w:w="4320"/>
+          </w:tcPr>
+          <w:p>
+            <w:r>
+              <w:t>Narrow, non-zero, OS-side surface: Windows icon/cursor resource parsers have had historical memory-corruption CVEs (e.g., animated-cursor-class bugs). A maliciously crafted icon resource could theoretically exploit an unpatched parser bug, independent of the DLL's own code.</w:t>
+            </w:r>
+          </w:p>
+        </w:tc>
+      </w:tr>
+      <w:tr>
+        <w:tc>
+          <w:tcPr>
+            <w:tcW w:type="dxa" w:w="4320"/>
+          </w:tcPr>
+          <w:p>
+            <w:r>
+              <w:t>Future-proofing / design fragility</w:t>
+            </w:r>
+          </w:p>
+        </w:tc>
+        <w:tc>
+          <w:tcPr>
+            <w:tcW w:type="dxa" w:w="4320"/>
+          </w:tcPr>
+          <w:p>
+            <w:r>
+              <w:t>If a future version or a different script loads this same filename via a normal LoadLibrary/Add-Type instead of ExtractIconEx, any embedded code would then execute. No current code path does this, but an unsigned file in the tree is one careless change away from becoming a real execution path.</w:t>
+            </w:r>
+          </w:p>
+        </w:tc>
+      </w:tr>
+      <w:tr>
+        <w:tc>
+          <w:tcPr>
+            <w:tcW w:type="dxa" w:w="4320"/>
+          </w:tcPr>
+          <w:p>
+            <w:r>
+              <w:t>AppLocker/WDAC bypass angle</w:t>
+            </w:r>
+          </w:p>
+        </w:tc>
+        <w:tc>
+          <w:tcPr>
+            <w:tcW w:type="dxa" w:w="4320"/>
+          </w:tcPr>
+          <w:p>
+            <w:r>
+              <w:t>Most signed-binary allow-list policies enforce on EXE launch, not DLL load, by default (DLL rule enforcement is off by default for performance reasons). This DLL would load without friction even under a signed-only policy — not because of exploitation, but because the control does not inspect it.</w:t>
+            </w:r>
+          </w:p>
+        </w:tc>
+      </w:tr>
+    </w:tbl>
+    <w:p>
+      <w:r>
+        <w:t>Conclusion: not a live path to full-solution compromise today, given its actual usage is resource-only icon extraction. It is correctly identified as the single point in the archive with no cryptographic tamper-evidence, and should be treated as the artifact to re-verify by hash (SHA-256 recorded in the BOM) on any future download, rather than as an active code-execution risk under the current call site.</w:t>
+      </w:r>
+    </w:p>
+    <w:p>
+      <w:pPr>
         <w:pStyle w:val="Heading2"/>
       </w:pPr>
       <w:r>

</xml_diff>

<commit_message>
Remove aka.ms/gettts section: unrelated noise from an initial typo mix-up
The gettts (double-T, TTS) alias was only investigated because it was
mistaken for gettss (TSS) at the start of this review, due to visual
similarity. It is a different, unregistered alias unrelated to the
TSS toolkit that is the actual subject of this review, and including
it as a "related alias"/risk item added noise without adding signal
about the thing being assessed. Removed the report section, risk-table
row, and recommendation bullet; renumbered subsequent sections (3.3->3.2,
3.4->3.3, 3.4.x->3.3.x, 3.5->3.4).

Co-Authored-By: Claude Sonnet 5 <noreply@anthropic.com>
Claude-Session: https://claude.ai/code/session_01MjYQcxWWR9pJZN5XKi6Ebx
</commit_message>
<xml_diff>
--- a/TSS_Security_Review.docx
+++ b/TSS_Security_Review.docx
@@ -275,20 +275,7 @@
         <w:pStyle w:val="Heading2"/>
       </w:pPr>
       <w:r>
-        <w:t>3.2 Related alias: aka.ms/gettts</w:t>
-      </w:r>
-    </w:p>
-    <w:p>
-      <w:r>
-        <w:t>The visually similar alias aka.ms/gettts (double-t, TTS not TSS) is currently UNREGISTERED. It falls back to Bing (Location: https://www.bing.com?ref=aka&amp;shorturl=gettts), which is aka.ms's standard behavior for a dead/unclaimed alias. This is a dangling-link risk: nothing prevents someone from registering it in the future and redirecting it elsewhere while it still displays as a trusted aka.ms domain.</w:t>
-      </w:r>
-    </w:p>
-    <w:p>
-      <w:pPr>
-        <w:pStyle w:val="Heading2"/>
-      </w:pPr>
-      <w:r>
-        <w:t>3.3 Archive contents overview</w:t>
+        <w:t>3.2 Archive contents overview</w:t>
       </w:r>
     </w:p>
     <w:p>
@@ -301,7 +288,7 @@
         <w:pStyle w:val="Heading2"/>
       </w:pPr>
       <w:r>
-        <w:t>3.4 Authenticode signature verification</w:t>
+        <w:t>3.3 Authenticode signature verification</w:t>
       </w:r>
     </w:p>
     <w:p>
@@ -629,7 +616,7 @@
         <w:pStyle w:val="Heading3"/>
       </w:pPr>
       <w:r>
-        <w:t>3.4.1 Unsigned PE finding</w:t>
+        <w:t>3.3.1 Unsigned PE finding</w:t>
       </w:r>
     </w:p>
     <w:tbl>
@@ -782,7 +769,7 @@
         <w:pStyle w:val="Heading3"/>
       </w:pPr>
       <w:r>
-        <w:t>3.4.2 Weak-link analysis: could the unsigned DLL compromise the solution?</w:t>
+        <w:t>3.3.2 Weak-link analysis: could the unsigned DLL compromise the solution?</w:t>
       </w:r>
     </w:p>
     <w:p>
@@ -948,7 +935,7 @@
         <w:pStyle w:val="Heading2"/>
       </w:pPr>
       <w:r>
-        <w:t>3.5 Provenance / upstream identity</w:t>
+        <w:t>3.4 Provenance / upstream identity</w:t>
       </w:r>
     </w:p>
     <w:p>
@@ -1046,38 +1033,6 @@
           </w:tcPr>
           <w:p>
             <w:r>
-              <w:t>Dangling-alias hijack (gettts)</w:t>
-            </w:r>
-          </w:p>
-        </w:tc>
-        <w:tc>
-          <w:tcPr>
-            <w:tcW w:type="dxa" w:w="2880"/>
-          </w:tcPr>
-          <w:p>
-            <w:r>
-              <w:t>Medium (latent)</w:t>
-            </w:r>
-          </w:p>
-        </w:tc>
-        <w:tc>
-          <w:tcPr>
-            <w:tcW w:type="dxa" w:w="2880"/>
-          </w:tcPr>
-          <w:p>
-            <w:r>
-              <w:t>Unregistered aka.ms alias could be claimed and repointed later while retaining implicit trust of the aka.ms domain.</w:t>
-            </w:r>
-          </w:p>
-        </w:tc>
-      </w:tr>
-      <w:tr>
-        <w:tc>
-          <w:tcPr>
-            <w:tcW w:type="dxa" w:w="2880"/>
-          </w:tcPr>
-          <w:p>
-            <w:r>
               <w:t>Capability abuse if misdelivered</w:t>
             </w:r>
           </w:p>
@@ -1158,14 +1113,6 @@
       </w:pPr>
       <w:r>
         <w:t>Pin and verify the archive SHA-256 (recorded in this report and the accompanying BOM) for any future re-download, rather than trusting the aka.ms redirect blindly each time.</w:t>
-      </w:r>
-    </w:p>
-    <w:p>
-      <w:pPr>
-        <w:pStyle w:val="ListBullet"/>
-      </w:pPr>
-      <w:r>
-        <w:t>Do not register or repurpose the aka.ms/gettts alias path in any internal documentation; treat any link claiming to be a TTS tool at that address as unverified until re-checked.</w:t>
       </w:r>
     </w:p>
     <w:p>

</xml_diff>

<commit_message>
Remove section 3.4 Provenance/upstream identity per request
Dropped the provenance narrative (TSS.MSR unrelated-project note,
community mirrors, Walter Eder attribution) along with its
corresponding Scope and Method bullet. Risk Assessment renumbers
cleanly from 4 (no cascading renumbering needed since it was the
last 3.x subsection).

Co-Authored-By: Claude Sonnet 5 <noreply@anthropic.com>
Claude-Session: https://claude.ai/code/session_01MjYQcxWWR9pJZN5XKi6Ebx
</commit_message>
<xml_diff>
--- a/TSS_Security_Review.docx
+++ b/TSS_Security_Review.docx
@@ -79,14 +79,6 @@
       </w:pPr>
       <w:r>
         <w:t>Verified embedded Authenticode signatures on all 115 PE binaries via osslsigncode: recomputed each binary's PE digest and compared it to the digest embedded in the signature (proves the signed bytes match what's on disk) — not merely checking for the presence of a certificate subject string.</w:t>
-      </w:r>
-    </w:p>
-    <w:p>
-      <w:pPr>
-        <w:pStyle w:val="ListBullet"/>
-      </w:pPr>
-      <w:r>
-        <w:t>Searched GitHub for canonical upstream source / provenance and cross-referenced against the unrelated microsoft/TSS.MSR (TPM stack) repository to rule out name-collision confusion.</w:t>
       </w:r>
     </w:p>
     <w:p>
@@ -932,19 +924,6 @@
     </w:p>
     <w:p>
       <w:pPr>
-        <w:pStyle w:val="Heading2"/>
-      </w:pPr>
-      <w:r>
-        <w:t>3.4 Provenance / upstream identity</w:t>
-      </w:r>
-    </w:p>
-    <w:p>
-      <w:r>
-        <w:t>No official microsoft/* GitHub repository hosts this toolkit under the TSS name; microsoft/TSS.MSR is a separate, actively maintained Microsoft Research project implementing the TPM 2.0 software stack — confirmed unrelated to this toolkit by description and content, not by release-history emptiness (that repository is active). Multiple independent community GitHub mirrors were found with matching file structure and identical internal warning strings (e.g. rsessa/TSS, andreipintica/TSSV2), consistent with a tool that circulates informally. The likely original author is Walter Eder, a Microsoft support/field engineer whose GitHub Pages site is described as hosting 'Windows Tools (TSS, psTSS, psSDP)', matching this toolkit's module naming (a psSDP directory is present in the archive). This is consistent with TSS's public reputation as a Microsoft CSS-support-engineer-authored diagnostic toolkit distributed via aka.ms/getTSS, rather than an official, centrally-supported Microsoft product.</w:t>
-      </w:r>
-    </w:p>
-    <w:p>
-      <w:pPr>
         <w:pStyle w:val="Heading1"/>
       </w:pPr>
       <w:r>

</xml_diff>

<commit_message>
Add complete 115-binary tool inventory: purpose + invocation instrumentation
Adds section 7 to the report and tool_inventory.csv/json: a full,
per-binary breakdown of every PE file in the archive, cross-referenced
against all 695 bundled .ps1/.psm1 scripts (not just the 19 top-level
TSS_*.psm1 modules) for real invocation evidence (file:line), not just
tool names.

Explicitly flags where automated substring matching produced false
positives (short/common names like du, kd, SAN, handle colliding with
unrelated code/comments) rather than presenting those as confirmed
instrumentation. Purpose descriptions for well-known public Sysinternals/
WDK tools draw on established public documentation; TSS-internal or
less-documented tools are described only as far as script context
supports, with unconfirmed inferences labeled as such.

Co-Authored-By: Claude Sonnet 5 <noreply@anthropic.com>
Claude-Session: https://claude.ai/code/session_01MjYQcxWWR9pJZN5XKi6Ebx
</commit_message>
<xml_diff>
--- a/TSS_Security_Review.docx
+++ b/TSS_Security_Review.docx
@@ -272,7 +272,7 @@
     </w:p>
     <w:p>
       <w:r>
-        <w:t>Top-level structure: TSS.ps1 / TSSGUI.ps1 (main entry points), 19 TSS_*.psm1 feature modules (ADS, AUT, CRM, DND, INT, ITN, MCM, NET, PRF, SDP, SHA, SPS, UEX...), and BIN / BINx64 / BINx86 / BINARM directories bundling third-party diagnostic executables (Procmon, Sysmon, procdump, xperf, wpr, psping, rpcdump, rpccfg, WinHTTPDiag, poolmon, etc.), plus scripts/, config/, help/, xray/ and psSDP/ support directories.</w:t>
+        <w:t>Top-level structure: TSS.ps1 / TSSGUI.ps1 (main entry points), 19 TSS_*.psm1 feature modules (ADS, AUT, CRM, DND, INT, ITN, MCM, NET, PRF, SDP, SHA, SPS, UEX...), and BIN / BINx64 / BINx86 / BINARM directories bundling third-party diagnostic executables (Procmon, Sysmon, procdump, xperf, wpr, psping, rpcdump, rpccfg, WinHTTPDiag, poolmon, etc.), plus scripts/, config/, help/, xray/ and psSDP/ support directories. A complete per-binary inventory of all 115 PE files — purpose and how each is invoked by TSS's PowerShell layer, with file:line evidence — is provided in section 7.</w:t>
       </w:r>
     </w:p>
     <w:p>
@@ -1138,6 +1138,4934 @@
         <w:t>Full file-level Bill of Materials (path, size, SHA-256, signer) is provided in bom.csv / bom.json in the accompanying repository.</w:t>
       </w:r>
     </w:p>
+    <w:p>
+      <w:pPr>
+        <w:pStyle w:val="Heading1"/>
+      </w:pPr>
+      <w:r>
+        <w:t>7. Bundled Tool Inventory (complete, all 115 PE binaries)</w:t>
+      </w:r>
+    </w:p>
+    <w:p>
+      <w:r>
+        <w:t>This is a complete, per-binary inventory of every PE file in the archive: what it is, and where/how TSS's own PowerShell layer invokes it. Evidence was gathered by searching all 695 .ps1/.psm1 files in the archive (not just the 19 top-level TSS_*.psm1 modules) for each binary's filename, and citing the first matching file:line found. Two important caveats:</w:t>
+      </w:r>
+    </w:p>
+    <w:p>
+      <w:pPr>
+        <w:pStyle w:val="ListBullet"/>
+      </w:pPr>
+      <w:r>
+        <w:t>Automated substring matching produces false positives on short/common names (e.g. "du", "kd", "SAN", "handle" colliding with unrelated words in comments or encoded blobs). Those cases are explicitly flagged below as unconfirmed rather than presented as verified instrumentation.</w:t>
+      </w:r>
+    </w:p>
+    <w:p>
+      <w:pPr>
+        <w:pStyle w:val="ListBullet"/>
+      </w:pPr>
+      <w:r>
+        <w:t>"Purpose" descriptions for well-known public Microsoft/Sysinternals/WDK tools (Procmon, Sysmon, procdump, PsPing, AccessChk, etc.) draw on their established public documentation. For TSS-internal or less-documented tools, purpose is stated only as far as the script context found actually supports — entries marked "not independently confirmed" are inference from naming/bundling convention, not verified fact.</w:t>
+      </w:r>
+    </w:p>
+    <w:tbl>
+      <w:tblPr>
+        <w:tblStyle w:val="LightGrid-Accent1"/>
+        <w:tblW w:type="auto" w:w="0"/>
+        <w:tblLook w:firstColumn="1" w:firstRow="1" w:lastColumn="0" w:lastRow="0" w:noHBand="0" w:noVBand="1" w:val="04A0"/>
+      </w:tblPr>
+      <w:tblGrid>
+        <w:gridCol w:w="2160"/>
+        <w:gridCol w:w="2160"/>
+        <w:gridCol w:w="2160"/>
+        <w:gridCol w:w="2160"/>
+      </w:tblGrid>
+      <w:tr>
+        <w:tc>
+          <w:tcPr>
+            <w:tcW w:type="dxa" w:w="2160"/>
+          </w:tcPr>
+          <w:p>
+            <w:r>
+              <w:t>Path</w:t>
+            </w:r>
+          </w:p>
+        </w:tc>
+        <w:tc>
+          <w:tcPr>
+            <w:tcW w:type="dxa" w:w="2160"/>
+          </w:tcPr>
+          <w:p>
+            <w:r>
+              <w:t>Signed / Digest OK</w:t>
+            </w:r>
+          </w:p>
+        </w:tc>
+        <w:tc>
+          <w:tcPr>
+            <w:tcW w:type="dxa" w:w="2160"/>
+          </w:tcPr>
+          <w:p>
+            <w:r>
+              <w:t>Purpose</w:t>
+            </w:r>
+          </w:p>
+        </w:tc>
+        <w:tc>
+          <w:tcPr>
+            <w:tcW w:type="dxa" w:w="2160"/>
+          </w:tcPr>
+          <w:p>
+            <w:r>
+              <w:t>Invocation evidence (file:line)</w:t>
+            </w:r>
+          </w:p>
+        </w:tc>
+      </w:tr>
+      <w:tr>
+        <w:tc>
+          <w:tcPr>
+            <w:tcW w:type="dxa" w:w="2160"/>
+          </w:tcPr>
+          <w:p>
+            <w:r>
+              <w:t>BIN/AgentConfigManagerLib.dll</w:t>
+            </w:r>
+          </w:p>
+        </w:tc>
+        <w:tc>
+          <w:tcPr>
+            <w:tcW w:type="dxa" w:w="2160"/>
+          </w:tcPr>
+          <w:p>
+            <w:r>
+              <w:t>Yes / Yes</w:t>
+            </w:r>
+          </w:p>
+        </w:tc>
+        <w:tc>
+          <w:tcPr>
+            <w:tcW w:type="dxa" w:w="2160"/>
+          </w:tcPr>
+          <w:p>
+            <w:r>
+              <w:t>Support library, no direct script reference found; name and bundling alongside MDEClientAnalyzer.exe suggest it is a dependency of the Microsoft Defender for Endpoint client analyzer, not independently confirmed.</w:t>
+            </w:r>
+          </w:p>
+        </w:tc>
+        <w:tc>
+          <w:tcPr>
+            <w:tcW w:type="dxa" w:w="2160"/>
+          </w:tcPr>
+          <w:p>
+            <w:r>
+              <w:t>No direct reference found in bundled scripts (695 .ps1/.psm1 files searched)</w:t>
+            </w:r>
+          </w:p>
+        </w:tc>
+      </w:tr>
+      <w:tr>
+        <w:tc>
+          <w:tcPr>
+            <w:tcW w:type="dxa" w:w="2160"/>
+          </w:tcPr>
+          <w:p>
+            <w:r>
+              <w:t>BIN/ConnectivityDiagnosis.exe</w:t>
+            </w:r>
+          </w:p>
+        </w:tc>
+        <w:tc>
+          <w:tcPr>
+            <w:tcW w:type="dxa" w:w="2160"/>
+          </w:tcPr>
+          <w:p>
+            <w:r>
+              <w:t>Yes / Yes</w:t>
+            </w:r>
+          </w:p>
+        </w:tc>
+        <w:tc>
+          <w:tcPr>
+            <w:tcW w:type="dxa" w:w="2160"/>
+          </w:tcPr>
+          <w:p>
+            <w:r>
+              <w:t>Network/telemetry connectivity diagnostic tool invoked by the UEX_Telemetry trace scenario with -verbose, output captured to a _Telemetry_ConnectivityDiagnosis.txt file.</w:t>
+            </w:r>
+          </w:p>
+        </w:tc>
+        <w:tc>
+          <w:tcPr>
+            <w:tcW w:type="dxa" w:w="2160"/>
+          </w:tcPr>
+          <w:p>
+            <w:r>
+              <w:t>TSS_UEX.psm1:160: ::  2023.04.11.0 [gr] _UEX: UEX_Telemetry : added the ConnectivityDiagnosis</w:t>
+            </w:r>
+          </w:p>
+        </w:tc>
+      </w:tr>
+      <w:tr>
+        <w:tc>
+          <w:tcPr>
+            <w:tcW w:type="dxa" w:w="2160"/>
+          </w:tcPr>
+          <w:p>
+            <w:r>
+              <w:t>BIN/Coreinfo.exe</w:t>
+            </w:r>
+          </w:p>
+        </w:tc>
+        <w:tc>
+          <w:tcPr>
+            <w:tcW w:type="dxa" w:w="2160"/>
+          </w:tcPr>
+          <w:p>
+            <w:r>
+              <w:t>Yes / Yes</w:t>
+            </w:r>
+          </w:p>
+        </w:tc>
+        <w:tc>
+          <w:tcPr>
+            <w:tcW w:type="dxa" w:w="2160"/>
+          </w:tcPr>
+          <w:p>
+            <w:r>
+              <w:t>Sysinternals Coreinfo — dumps CPU topology, cache, and supported instruction-set features. TSS checks for its presence via Get-Command before use.</w:t>
+            </w:r>
+          </w:p>
+        </w:tc>
+        <w:tc>
+          <w:tcPr>
+            <w:tcW w:type="dxa" w:w="2160"/>
+          </w:tcPr>
+          <w:p>
+            <w:r>
+              <w:t>TSS.ps1:6809: # CoreInfo</w:t>
+            </w:r>
+          </w:p>
+        </w:tc>
+      </w:tr>
+      <w:tr>
+        <w:tc>
+          <w:tcPr>
+            <w:tcW w:type="dxa" w:w="2160"/>
+          </w:tcPr>
+          <w:p>
+            <w:r>
+              <w:t>BIN/DatabaseAnalyzer.exe</w:t>
+            </w:r>
+          </w:p>
+        </w:tc>
+        <w:tc>
+          <w:tcPr>
+            <w:tcW w:type="dxa" w:w="2160"/>
+          </w:tcPr>
+          <w:p>
+            <w:r>
+              <w:t>Yes / Yes</w:t>
+            </w:r>
+          </w:p>
+        </w:tc>
+        <w:tc>
+          <w:tcPr>
+            <w:tcW w:type="dxa" w:w="2160"/>
+          </w:tcPr>
+          <w:p>
+            <w:r>
+              <w:t>Active Directory database (ESE/NTDS.dit) analyzer tool, migrated into the ADS (Active Directory Services) module per its changelog.</w:t>
+            </w:r>
+          </w:p>
+        </w:tc>
+        <w:tc>
+          <w:tcPr>
+            <w:tcW w:type="dxa" w:w="2160"/>
+          </w:tcPr>
+          <w:p>
+            <w:r>
+              <w:t>TSS_ADS.psm1:46: ::  2024.08.23.0 [mm] _ADS: Migrating Big5ADMonitoringScripts, DatabaseAnalyzer and save-LSP-GPSVC-Netlogon (.bak monitoring) to TSS #748, #749 and #752</w:t>
+            </w:r>
+          </w:p>
+        </w:tc>
+      </w:tr>
+      <w:tr>
+        <w:tc>
+          <w:tcPr>
+            <w:tcW w:type="dxa" w:w="2160"/>
+          </w:tcPr>
+          <w:p>
+            <w:r>
+              <w:t>BIN/DisplayExtendedAttribute.exe</w:t>
+            </w:r>
+          </w:p>
+        </w:tc>
+        <w:tc>
+          <w:tcPr>
+            <w:tcW w:type="dxa" w:w="2160"/>
+          </w:tcPr>
+          <w:p>
+            <w:r>
+              <w:t>Yes / Yes</w:t>
+            </w:r>
+          </w:p>
+        </w:tc>
+        <w:tc>
+          <w:tcPr>
+            <w:tcW w:type="dxa" w:w="2160"/>
+          </w:tcPr>
+          <w:p>
+            <w:r>
+              <w:t>Displays Windows Information Protection / DLP extended file attributes; referenced by the DLP diagnostics script as a manually-invoked companion tool.</w:t>
+            </w:r>
+          </w:p>
+        </w:tc>
+        <w:tc>
+          <w:tcPr>
+            <w:tcW w:type="dxa" w:w="2160"/>
+          </w:tcPr>
+          <w:p>
+            <w:r>
+              <w:t>scripts/DefTools/DLPDiagnose.ps1:2263: Write-ColorOutput White '   2. Extract the downloaded zip file which contains the tool DisplayExtendedAttributes.exe'</w:t>
+            </w:r>
+          </w:p>
+        </w:tc>
+      </w:tr>
+      <w:tr>
+        <w:tc>
+          <w:tcPr>
+            <w:tcW w:type="dxa" w:w="2160"/>
+          </w:tcPr>
+          <w:p>
+            <w:r>
+              <w:t>BIN/MDEClientAnalyzer.exe</w:t>
+            </w:r>
+          </w:p>
+        </w:tc>
+        <w:tc>
+          <w:tcPr>
+            <w:tcW w:type="dxa" w:w="2160"/>
+          </w:tcPr>
+          <w:p>
+            <w:r>
+              <w:t>Yes / Yes</w:t>
+            </w:r>
+          </w:p>
+        </w:tc>
+        <w:tc>
+          <w:tcPr>
+            <w:tcW w:type="dxa" w:w="2160"/>
+          </w:tcPr>
+          <w:p>
+            <w:r>
+              <w:t>Microsoft Defender for Endpoint (MDE) Client Analyzer — official Microsoft tool for diagnosing MDE sensor onboarding/health issues; downloaded and invoked by the DefTools MDE performance analyzer script.</w:t>
+            </w:r>
+          </w:p>
+        </w:tc>
+        <w:tc>
+          <w:tcPr>
+            <w:tcW w:type="dxa" w:w="2160"/>
+          </w:tcPr>
+          <w:p>
+            <w:r>
+              <w:t>scripts/DefTools/MDELiveAnalyzerPerf.ps1:3: $resultOutputDir = "C:\ProgramData\Microsoft\Windows Defender Advanced Threat Protection\Downloads\MDEClientAnalyzerResult"</w:t>
+            </w:r>
+          </w:p>
+        </w:tc>
+      </w:tr>
+      <w:tr>
+        <w:tc>
+          <w:tcPr>
+            <w:tcW w:type="dxa" w:w="2160"/>
+          </w:tcPr>
+          <w:p>
+            <w:r>
+              <w:t>BIN/MDEClientAnalyzerPreviousVersion.exe</w:t>
+            </w:r>
+          </w:p>
+        </w:tc>
+        <w:tc>
+          <w:tcPr>
+            <w:tcW w:type="dxa" w:w="2160"/>
+          </w:tcPr>
+          <w:p>
+            <w:r>
+              <w:t>Yes / Yes</w:t>
+            </w:r>
+          </w:p>
+        </w:tc>
+        <w:tc>
+          <w:tcPr>
+            <w:tcW w:type="dxa" w:w="2160"/>
+          </w:tcPr>
+          <w:p>
+            <w:r>
+              <w:t>No direct script reference found; by naming convention, a fallback/compatibility copy of MDEClientAnalyzer.exe for environments requiring an older analyzer version.</w:t>
+            </w:r>
+          </w:p>
+        </w:tc>
+        <w:tc>
+          <w:tcPr>
+            <w:tcW w:type="dxa" w:w="2160"/>
+          </w:tcPr>
+          <w:p>
+            <w:r>
+              <w:t>No direct reference found in bundled scripts (695 .ps1/.psm1 files searched)</w:t>
+            </w:r>
+          </w:p>
+        </w:tc>
+      </w:tr>
+      <w:tr>
+        <w:tc>
+          <w:tcPr>
+            <w:tcW w:type="dxa" w:w="2160"/>
+          </w:tcPr>
+          <w:p>
+            <w:r>
+              <w:t>BIN/Procmon.exe</w:t>
+            </w:r>
+          </w:p>
+        </w:tc>
+        <w:tc>
+          <w:tcPr>
+            <w:tcW w:type="dxa" w:w="2160"/>
+          </w:tcPr>
+          <w:p>
+            <w:r>
+              <w:t>Yes / Yes</w:t>
+            </w:r>
+          </w:p>
+        </w:tc>
+        <w:tc>
+          <w:tcPr>
+            <w:tcW w:type="dxa" w:w="2160"/>
+          </w:tcPr>
+          <w:p>
+            <w:r>
+              <w:t>Sysinternals Process Monitor — real-time file system/registry/process/thread activity monitor; started and stopped via Start-Process with dynamically built argument lists (see prior conversation turn for exact invocation lines).</w:t>
+            </w:r>
+          </w:p>
+        </w:tc>
+        <w:tc>
+          <w:tcPr>
+            <w:tcW w:type="dxa" w:w="2160"/>
+          </w:tcPr>
+          <w:p>
+            <w:r>
+              <w:t>TSSGUI.ps1:1930: # Change text color for lines starting with "ProcMon"</w:t>
+            </w:r>
+          </w:p>
+        </w:tc>
+      </w:tr>
+      <w:tr>
+        <w:tc>
+          <w:tcPr>
+            <w:tcW w:type="dxa" w:w="2160"/>
+          </w:tcPr>
+          <w:p>
+            <w:r>
+              <w:t>BIN/SQLCheck.exe</w:t>
+            </w:r>
+          </w:p>
+        </w:tc>
+        <w:tc>
+          <w:tcPr>
+            <w:tcW w:type="dxa" w:w="2160"/>
+          </w:tcPr>
+          <w:p>
+            <w:r>
+              <w:t>Yes / Yes</w:t>
+            </w:r>
+          </w:p>
+        </w:tc>
+        <w:tc>
+          <w:tcPr>
+            <w:tcW w:type="dxa" w:w="2160"/>
+          </w:tcPr>
+          <w:p>
+            <w:r>
+              <w:t>SQL Server connectivity/health check tool, gated behind the NET_SQLcheck switch and also invoked from the psSDP SQL base diagnostics script.</w:t>
+            </w:r>
+          </w:p>
+        </w:tc>
+        <w:tc>
+          <w:tcPr>
+            <w:tcW w:type="dxa" w:w="2160"/>
+          </w:tcPr>
+          <w:p>
+            <w:r>
+              <w:t>TSS.ps1:813: [Switch]$NET_SQLcheck,</w:t>
+            </w:r>
+          </w:p>
+        </w:tc>
+      </w:tr>
+      <w:tr>
+        <w:tc>
+          <w:tcPr>
+            <w:tcW w:type="dxa" w:w="2160"/>
+          </w:tcPr>
+          <w:p>
+            <w:r>
+              <w:t>BIN/Showpriv.exe</w:t>
+            </w:r>
+          </w:p>
+        </w:tc>
+        <w:tc>
+          <w:tcPr>
+            <w:tcW w:type="dxa" w:w="2160"/>
+          </w:tcPr>
+          <w:p>
+            <w:r>
+              <w:t>Yes / Yes</w:t>
+            </w:r>
+          </w:p>
+        </w:tc>
+        <w:tc>
+          <w:tcPr>
+            <w:tcW w:type="dxa" w:w="2160"/>
+          </w:tcPr>
+          <w:p>
+            <w:r>
+              <w:t>Displays the effective Windows privileges held by the current token (e.g. SeTakeOwnershipPrivilege); invoked by the psSDP user-rights diagnostic script.</w:t>
+            </w:r>
+          </w:p>
+        </w:tc>
+        <w:tc>
+          <w:tcPr>
+            <w:tcW w:type="dxa" w:w="2160"/>
+          </w:tcPr>
+          <w:p>
+            <w:r>
+              <w:t>psSDP/Diag/global/DC_UserRights.ps1:19: 'Skipping running {showpriv.exe} since it is not supported in ' + $OSArchitecture + ' architecture.' | WriteTo-StdOut</w:t>
+            </w:r>
+          </w:p>
+        </w:tc>
+      </w:tr>
+      <w:tr>
+        <w:tc>
+          <w:tcPr>
+            <w:tcW w:type="dxa" w:w="2160"/>
+          </w:tcPr>
+          <w:p>
+            <w:r>
+              <w:t>BIN/Sysmon.exe</w:t>
+            </w:r>
+          </w:p>
+        </w:tc>
+        <w:tc>
+          <w:tcPr>
+            <w:tcW w:type="dxa" w:w="2160"/>
+          </w:tcPr>
+          <w:p>
+            <w:r>
+              <w:t>Yes / Yes</w:t>
+            </w:r>
+          </w:p>
+        </w:tc>
+        <w:tc>
+          <w:tcPr>
+            <w:tcW w:type="dxa" w:w="2160"/>
+          </w:tcPr>
+          <w:p>
+            <w:r>
+              <w:t>Sysinternals System Monitor — kernel-driver-based ETW logger for detailed process creation, network connection, and file-change events; one of the trace types named in TSS's own synopsis.</w:t>
+            </w:r>
+          </w:p>
+        </w:tc>
+        <w:tc>
+          <w:tcPr>
+            <w:tcW w:type="dxa" w:w="2160"/>
+          </w:tcPr>
+          <w:p>
+            <w:r>
+              <w:t>TSS.ps1:3: Collect traces for Windows (ADS/CRM/DND/INT/ITN/NET/PRF/SHA/SPS/UEX/VSOD) and Netsh(packet capture)/Procmon/PerfMon/PSR/Video/SysMon/WPR/xPerf/TTD asf.</w:t>
+            </w:r>
+          </w:p>
+        </w:tc>
+      </w:tr>
+      <w:tr>
+        <w:tc>
+          <w:tcPr>
+            <w:tcW w:type="dxa" w:w="2160"/>
+          </w:tcPr>
+          <w:p>
+            <w:r>
+              <w:t>BIN/VmlTrace.exe</w:t>
+            </w:r>
+          </w:p>
+        </w:tc>
+        <w:tc>
+          <w:tcPr>
+            <w:tcW w:type="dxa" w:w="2160"/>
+          </w:tcPr>
+          <w:p>
+            <w:r>
+              <w:t>Yes / Yes</w:t>
+            </w:r>
+          </w:p>
+        </w:tc>
+        <w:tc>
+          <w:tcPr>
+            <w:tcW w:type="dxa" w:w="2160"/>
+          </w:tcPr>
+          <w:p>
+            <w:r>
+              <w:t>Hyper-V VML (virtualization infrastructure driver) trace collection tool, used for Hyper-V verbosity tracing per the storage (SHA) module and a dedicated VMLverbosity helper script.</w:t>
+            </w:r>
+          </w:p>
+        </w:tc>
+        <w:tc>
+          <w:tcPr>
+            <w:tcW w:type="dxa" w:w="2160"/>
+          </w:tcPr>
+          <w:p>
+            <w:r>
+              <w:t>scripts/tss_VMLverbosity.ps1:6: This is a Powershell script to collect Hyper-V traces when the scenario time is too long for a VMLTrace</w:t>
+            </w:r>
+          </w:p>
+        </w:tc>
+      </w:tr>
+      <w:tr>
+        <w:tc>
+          <w:tcPr>
+            <w:tcW w:type="dxa" w:w="2160"/>
+          </w:tcPr>
+          <w:p>
+            <w:r>
+              <w:t>BIN/VmlTrace_2012.exe</w:t>
+            </w:r>
+          </w:p>
+        </w:tc>
+        <w:tc>
+          <w:tcPr>
+            <w:tcW w:type="dxa" w:w="2160"/>
+          </w:tcPr>
+          <w:p>
+            <w:r>
+              <w:t>Yes / Yes</w:t>
+            </w:r>
+          </w:p>
+        </w:tc>
+        <w:tc>
+          <w:tcPr>
+            <w:tcW w:type="dxa" w:w="2160"/>
+          </w:tcPr>
+          <w:p>
+            <w:r>
+              <w:t>Windows Server 2012 (build 9200) -specific build of VmlTrace.exe, selected conditionally based on detected OS build.</w:t>
+            </w:r>
+          </w:p>
+        </w:tc>
+        <w:tc>
+          <w:tcPr>
+            <w:tcW w:type="dxa" w:w="2160"/>
+          </w:tcPr>
+          <w:p>
+            <w:r>
+              <w:t>TSS_SHA.psm1:75: if ($global:OSVersion.Build -eq 9200) {$VmlTrace_exe = $global:ScriptFolder + "\BIN\VmlTrace_2012.exe"}else{$VmlTrace_exe = $global:ScriptFolder + "\BIN\VmlTrac</w:t>
+            </w:r>
+          </w:p>
+        </w:tc>
+      </w:tr>
+      <w:tr>
+        <w:tc>
+          <w:tcPr>
+            <w:tcW w:type="dxa" w:w="2160"/>
+          </w:tcPr>
+          <w:p>
+            <w:r>
+              <w:t>BIN/WinHTTPDiag.exe</w:t>
+            </w:r>
+          </w:p>
+        </w:tc>
+        <w:tc>
+          <w:tcPr>
+            <w:tcW w:type="dxa" w:w="2160"/>
+          </w:tcPr>
+          <w:p>
+            <w:r>
+              <w:t>Yes / Yes</w:t>
+            </w:r>
+          </w:p>
+        </w:tc>
+        <w:tc>
+          <w:tcPr>
+            <w:tcW w:type="dxa" w:w="2160"/>
+          </w:tcPr>
+          <w:p>
+            <w:r>
+              <w:t>WinHTTP configuration/proxy diagnostic tool, invoked with -i to dump WinHTTP settings as part of the NET_Proxy network trace scenario.</w:t>
+            </w:r>
+          </w:p>
+        </w:tc>
+        <w:tc>
+          <w:tcPr>
+            <w:tcW w:type="dxa" w:w="2160"/>
+          </w:tcPr>
+          <w:p>
+            <w:r>
+              <w:t>TSS.ps1:6114: "WinHTTPDiag.exe -i | Out-File -Append $outFile"</w:t>
+            </w:r>
+          </w:p>
+        </w:tc>
+      </w:tr>
+      <w:tr>
+        <w:tc>
+          <w:tcPr>
+            <w:tcW w:type="dxa" w:w="2160"/>
+          </w:tcPr>
+          <w:p>
+            <w:r>
+              <w:t>BIN/accesschk.exe</w:t>
+            </w:r>
+          </w:p>
+        </w:tc>
+        <w:tc>
+          <w:tcPr>
+            <w:tcW w:type="dxa" w:w="2160"/>
+          </w:tcPr>
+          <w:p>
+            <w:r>
+              <w:t>Yes / Yes</w:t>
+            </w:r>
+          </w:p>
+        </w:tc>
+        <w:tc>
+          <w:tcPr>
+            <w:tcW w:type="dxa" w:w="2160"/>
+          </w:tcPr>
+          <w:p>
+            <w:r>
+              <w:t>Sysinternals AccessChk — reports effective permissions on files, registry keys, and services; invoked as part of DHCP-related access-check data collection in the NET module.</w:t>
+            </w:r>
+          </w:p>
+        </w:tc>
+        <w:tc>
+          <w:tcPr>
+            <w:tcW w:type="dxa" w:w="2160"/>
+          </w:tcPr>
+          <w:p>
+            <w:r>
+              <w:t>TSS_NET.psm1:474: $NET_AccessChkProviders = @()</w:t>
+            </w:r>
+          </w:p>
+        </w:tc>
+      </w:tr>
+      <w:tr>
+        <w:tc>
+          <w:tcPr>
+            <w:tcW w:type="dxa" w:w="2160"/>
+          </w:tcPr>
+          <w:p>
+            <w:r>
+              <w:t>BIN/autorunsc.exe</w:t>
+            </w:r>
+          </w:p>
+        </w:tc>
+        <w:tc>
+          <w:tcPr>
+            <w:tcW w:type="dxa" w:w="2160"/>
+          </w:tcPr>
+          <w:p>
+            <w:r>
+              <w:t>Yes / Yes</w:t>
+            </w:r>
+          </w:p>
+        </w:tc>
+        <w:tc>
+          <w:tcPr>
+            <w:tcW w:type="dxa" w:w="2160"/>
+          </w:tcPr>
+          <w:p>
+            <w:r>
+              <w:t>Sysinternals Autoruns (command-line edition) — lists autostart execution points; invoked by a psSDP registry-autoruns diagnostic script.</w:t>
+            </w:r>
+          </w:p>
+        </w:tc>
+        <w:tc>
+          <w:tcPr>
+            <w:tcW w:type="dxa" w:w="2160"/>
+          </w:tcPr>
+          <w:p>
+            <w:r>
+              <w:t>psSDP/Diag/global/TS_RegistryEntryForAutorunsCheck.ps1:2: # TS_RegistryEntryForAutorunsCheck.ps1</w:t>
+            </w:r>
+          </w:p>
+        </w:tc>
+      </w:tr>
+      <w:tr>
+        <w:tc>
+          <w:tcPr>
+            <w:tcW w:type="dxa" w:w="2160"/>
+          </w:tcPr>
+          <w:p>
+            <w:r>
+              <w:t>BIN/avdnettest.exe</w:t>
+            </w:r>
+          </w:p>
+        </w:tc>
+        <w:tc>
+          <w:tcPr>
+            <w:tcW w:type="dxa" w:w="2160"/>
+          </w:tcPr>
+          <w:p>
+            <w:r>
+              <w:t>Yes / Yes</w:t>
+            </w:r>
+          </w:p>
+        </w:tc>
+        <w:tc>
+          <w:tcPr>
+            <w:tcW w:type="dxa" w:w="2160"/>
+          </w:tcPr>
+          <w:p>
+            <w:r>
+              <w:t>Azure Virtual Desktop network connectivity test tool, located and invoked by the MSRD-Collect (Multi-Session Remote Desktop) module for AVD network diagnostics.</w:t>
+            </w:r>
+          </w:p>
+        </w:tc>
+        <w:tc>
+          <w:tcPr>
+            <w:tcW w:type="dxa" w:w="2160"/>
+          </w:tcPr>
+          <w:p>
+            <w:r>
+              <w:t>scripts/MSRD-Collect/MSRD-Collect.ps1:1534: $global:avdnettestpath = Get-MsrdToolPath "avdnettest.exe"</w:t>
+            </w:r>
+          </w:p>
+        </w:tc>
+      </w:tr>
+      <w:tr>
+        <w:tc>
+          <w:tcPr>
+            <w:tcW w:type="dxa" w:w="2160"/>
+          </w:tcPr>
+          <w:p>
+            <w:r>
+              <w:t>BIN/devcon.exe</w:t>
+            </w:r>
+          </w:p>
+        </w:tc>
+        <w:tc>
+          <w:tcPr>
+            <w:tcW w:type="dxa" w:w="2160"/>
+          </w:tcPr>
+          <w:p>
+            <w:r>
+              <w:t>Yes / Yes</w:t>
+            </w:r>
+          </w:p>
+        </w:tc>
+        <w:tc>
+          <w:tcPr>
+            <w:tcW w:type="dxa" w:w="2160"/>
+          </w:tcPr>
+          <w:p>
+            <w:r>
+              <w:t>Microsoft Device Console (from the WDK) — enumerates and manages devices/drivers; invoked by a psSDP setup diagnostics script.</w:t>
+            </w:r>
+          </w:p>
+        </w:tc>
+        <w:tc>
+          <w:tcPr>
+            <w:tcW w:type="dxa" w:w="2160"/>
+          </w:tcPr>
+          <w:p>
+            <w:r>
+              <w:t>psSDP/Diag/global/TS_AutoAddCommands_SETUP.ps1:56: # Obtain information about Devices and connections using devcon.exe utility</w:t>
+            </w:r>
+          </w:p>
+        </w:tc>
+      </w:tr>
+      <w:tr>
+        <w:tc>
+          <w:tcPr>
+            <w:tcW w:type="dxa" w:w="2160"/>
+          </w:tcPr>
+          <w:p>
+            <w:r>
+              <w:t>BIN/diskspd.exe</w:t>
+            </w:r>
+          </w:p>
+        </w:tc>
+        <w:tc>
+          <w:tcPr>
+            <w:tcW w:type="dxa" w:w="2160"/>
+          </w:tcPr>
+          <w:p>
+            <w:r>
+              <w:t>Yes / Yes</w:t>
+            </w:r>
+          </w:p>
+        </w:tc>
+        <w:tc>
+          <w:tcPr>
+            <w:tcW w:type="dxa" w:w="2160"/>
+          </w:tcPr>
+          <w:p>
+            <w:r>
+              <w:t>Microsoft DiskSpd — storage I/O performance benchmarking tool; used to generate synthetic load for SMB performance test scenarios.</w:t>
+            </w:r>
+          </w:p>
+        </w:tc>
+        <w:tc>
+          <w:tcPr>
+            <w:tcW w:type="dxa" w:w="2160"/>
+          </w:tcPr>
+          <w:p>
+            <w:r>
+              <w:t>TSS.ps1:30547: # We will use diskspd for this case</w:t>
+            </w:r>
+          </w:p>
+        </w:tc>
+      </w:tr>
+      <w:tr>
+        <w:tc>
+          <w:tcPr>
+            <w:tcW w:type="dxa" w:w="2160"/>
+          </w:tcPr>
+          <w:p>
+            <w:r>
+              <w:t>BIN/fruti_1903.exe</w:t>
+            </w:r>
+          </w:p>
+        </w:tc>
+        <w:tc>
+          <w:tcPr>
+            <w:tcW w:type="dxa" w:w="2160"/>
+          </w:tcPr>
+          <w:p>
+            <w:r>
+              <w:t>Yes / Yes</w:t>
+            </w:r>
+          </w:p>
+        </w:tc>
+        <w:tc>
+          <w:tcPr>
+            <w:tcW w:type="dxa" w:w="2160"/>
+          </w:tcPr>
+          <w:p>
+            <w:r>
+              <w:t>Internal storage/filter-driver diagnostic tool ('Fruti') used for storage tracing in the SHA (storage) module; this build selected for OS build &gt;= 18362 (1903+).</w:t>
+            </w:r>
+          </w:p>
+        </w:tc>
+        <w:tc>
+          <w:tcPr>
+            <w:tcW w:type="dxa" w:w="2160"/>
+          </w:tcPr>
+          <w:p>
+            <w:r>
+              <w:t>TSS_SHA.psm1:74: if ($global:OSVersion.Build -ge 18362) {$FrutiExe = $global:ScriptFolder + "\BIN\fruti_1903.exe"} else {$FrutiExe = $global:ScriptFolder + "\BIN\fruti_RS1.exe"}</w:t>
+            </w:r>
+          </w:p>
+        </w:tc>
+      </w:tr>
+      <w:tr>
+        <w:tc>
+          <w:tcPr>
+            <w:tcW w:type="dxa" w:w="2160"/>
+          </w:tcPr>
+          <w:p>
+            <w:r>
+              <w:t>BIN/fruti_RS1.exe</w:t>
+            </w:r>
+          </w:p>
+        </w:tc>
+        <w:tc>
+          <w:tcPr>
+            <w:tcW w:type="dxa" w:w="2160"/>
+          </w:tcPr>
+          <w:p>
+            <w:r>
+              <w:t>Yes / Yes</w:t>
+            </w:r>
+          </w:p>
+        </w:tc>
+        <w:tc>
+          <w:tcPr>
+            <w:tcW w:type="dxa" w:w="2160"/>
+          </w:tcPr>
+          <w:p>
+            <w:r>
+              <w:t>Same Fruti storage diagnostic tool as fruti_1903.exe; this build selected for older OS builds (&lt; 18362 / pre-1903, i.e. RS1-era).</w:t>
+            </w:r>
+          </w:p>
+        </w:tc>
+        <w:tc>
+          <w:tcPr>
+            <w:tcW w:type="dxa" w:w="2160"/>
+          </w:tcPr>
+          <w:p>
+            <w:r>
+              <w:t>TSS_SHA.psm1:74: if ($global:OSVersion.Build -ge 18362) {$FrutiExe = $global:ScriptFolder + "\BIN\fruti_1903.exe"} else {$FrutiExe = $global:ScriptFolder + "\BIN\fruti_RS1.exe"}</w:t>
+            </w:r>
+          </w:p>
+        </w:tc>
+      </w:tr>
+      <w:tr>
+        <w:tc>
+          <w:tcPr>
+            <w:tcW w:type="dxa" w:w="2160"/>
+          </w:tcPr>
+          <w:p>
+            <w:r>
+              <w:t>BIN/handle.exe</w:t>
+            </w:r>
+          </w:p>
+        </w:tc>
+        <w:tc>
+          <w:tcPr>
+            <w:tcW w:type="dxa" w:w="2160"/>
+          </w:tcPr>
+          <w:p>
+            <w:r>
+              <w:t>Yes / Yes</w:t>
+            </w:r>
+          </w:p>
+        </w:tc>
+        <w:tc>
+          <w:tcPr>
+            <w:tcW w:type="dxa" w:w="2160"/>
+          </w:tcPr>
+          <w:p>
+            <w:r>
+              <w:t>Likely Sysinternals Handle (lists open handles per process) by name and bundling convention, but the automated script match was a false positive (matched the unrelated phrase 'handle ownership issues' in a GUI code comment) — no confirmed direct invocation found in the reviewed scripts.</w:t>
+            </w:r>
+          </w:p>
+        </w:tc>
+        <w:tc>
+          <w:tcPr>
+            <w:tcW w:type="dxa" w:w="2160"/>
+          </w:tcPr>
+          <w:p>
+            <w:r>
+              <w:t>TSSGUI.ps1:215: // Create a copy of the icon to avoid handle ownership issues</w:t>
+            </w:r>
+          </w:p>
+        </w:tc>
+      </w:tr>
+      <w:tr>
+        <w:tc>
+          <w:tcPr>
+            <w:tcW w:type="dxa" w:w="2160"/>
+          </w:tcPr>
+          <w:p>
+            <w:r>
+              <w:t>BIN/kd.exe</w:t>
+            </w:r>
+          </w:p>
+        </w:tc>
+        <w:tc>
+          <w:tcPr>
+            <w:tcW w:type="dxa" w:w="2160"/>
+          </w:tcPr>
+          <w:p>
+            <w:r>
+              <w:t>Yes / Yes</w:t>
+            </w:r>
+          </w:p>
+        </w:tc>
+        <w:tc>
+          <w:tcPr>
+            <w:tcW w:type="dxa" w:w="2160"/>
+          </w:tcPr>
+          <w:p>
+            <w:r>
+              <w:t>Likely the Microsoft Kernel Debugger (kd.exe, from Debugging Tools for Windows) by name and bundling alongside cdb.exe/livekd.exe, but the automated script match was a false positive (matched inside an unrelated base64-encoded certificate blob) — no confirmed direct invocation found.</w:t>
+            </w:r>
+          </w:p>
+        </w:tc>
+        <w:tc>
+          <w:tcPr>
+            <w:tcW w:type="dxa" w:w="2160"/>
+          </w:tcPr>
+          <w:p>
+            <w:r>
+              <w:t>TSSGUI.ps1:4060: # VQQKExVNaWNyb3NvZnQgQ29ycG9yYXRpb24xKDAmBgNVBAMTH01pY3Jvc29mdCBD</w:t>
+            </w:r>
+          </w:p>
+        </w:tc>
+      </w:tr>
+      <w:tr>
+        <w:tc>
+          <w:tcPr>
+            <w:tcW w:type="dxa" w:w="2160"/>
+          </w:tcPr>
+          <w:p>
+            <w:r>
+              <w:t>BIN/livekd.exe</w:t>
+            </w:r>
+          </w:p>
+        </w:tc>
+        <w:tc>
+          <w:tcPr>
+            <w:tcW w:type="dxa" w:w="2160"/>
+          </w:tcPr>
+          <w:p>
+            <w:r>
+              <w:t>Yes / Yes</w:t>
+            </w:r>
+          </w:p>
+        </w:tc>
+        <w:tc>
+          <w:tcPr>
+            <w:tcW w:type="dxa" w:w="2160"/>
+          </w:tcPr>
+          <w:p>
+            <w:r>
+              <w:t>Sysinternals LiveKD — allows running the kernel debugger against a live system; gated behind an explicit -LiveKD parameter/switch in TSS.ps1.</w:t>
+            </w:r>
+          </w:p>
+        </w:tc>
+        <w:tc>
+          <w:tcPr>
+            <w:tcW w:type="dxa" w:w="2160"/>
+          </w:tcPr>
+          <w:p>
+            <w:r>
+              <w:t>TSS.ps1:1388: [String]$LiveKD,</w:t>
+            </w:r>
+          </w:p>
+        </w:tc>
+      </w:tr>
+      <w:tr>
+        <w:tc>
+          <w:tcPr>
+            <w:tcW w:type="dxa" w:w="2160"/>
+          </w:tcPr>
+          <w:p>
+            <w:r>
+              <w:t>BIN/npivtool.exe</w:t>
+            </w:r>
+          </w:p>
+        </w:tc>
+        <w:tc>
+          <w:tcPr>
+            <w:tcW w:type="dxa" w:w="2160"/>
+          </w:tcPr>
+          <w:p>
+            <w:r>
+              <w:t>Yes / Yes</w:t>
+            </w:r>
+          </w:p>
+        </w:tc>
+        <w:tc>
+          <w:tcPr>
+            <w:tcW w:type="dxa" w:w="2160"/>
+          </w:tcPr>
+          <w:p>
+            <w:r>
+              <w:t>Storage/Fibre Channel NPIV (N-Port ID Virtualization) diagnostic tool, invoked with -listallports and -showlunmappings in the storage (SHA) module.</w:t>
+            </w:r>
+          </w:p>
+        </w:tc>
+        <w:tc>
+          <w:tcPr>
+            <w:tcW w:type="dxa" w:w="2160"/>
+          </w:tcPr>
+          <w:p>
+            <w:r>
+              <w:t>TSS_SHA.psm1:2881: "$global:ScriptFolder\BIN\npivtool.exe -listallports | Out-File ${LogFolder}\${Env:COMPUTERNAME}_npivtool-listallports.txt",</w:t>
+            </w:r>
+          </w:p>
+        </w:tc>
+      </w:tr>
+      <w:tr>
+        <w:tc>
+          <w:tcPr>
+            <w:tcW w:type="dxa" w:w="2160"/>
+          </w:tcPr>
+          <w:p>
+            <w:r>
+              <w:t>BIN/nvspinfo.exe</w:t>
+            </w:r>
+          </w:p>
+        </w:tc>
+        <w:tc>
+          <w:tcPr>
+            <w:tcW w:type="dxa" w:w="2160"/>
+          </w:tcPr>
+          <w:p>
+            <w:r>
+              <w:t>Yes / Yes</w:t>
+            </w:r>
+          </w:p>
+        </w:tc>
+        <w:tc>
+          <w:tcPr>
+            <w:tcW w:type="dxa" w:w="2160"/>
+          </w:tcPr>
+          <w:p>
+            <w:r>
+              <w:t>Referenced by name in a Hyper-V networking diagnostic script, but that script actually invokes companion .js files (nvspinfo.js/nvspinfov2.js) via cscript rather than this .exe directly — its exact role alongside those scripts was not confirmed.</w:t>
+            </w:r>
+          </w:p>
+        </w:tc>
+        <w:tc>
+          <w:tcPr>
+            <w:tcW w:type="dxa" w:w="2160"/>
+          </w:tcPr>
+          <w:p>
+            <w:r>
+              <w:t>psSDP/Diag/global/DC_HyperVNetInfo.ps1:18: $CommandToExecute = "cmd.exe /c cscript.exe //nologo nvspinfo.js /z &gt; $OutputFile"</w:t>
+            </w:r>
+          </w:p>
+        </w:tc>
+      </w:tr>
+      <w:tr>
+        <w:tc>
+          <w:tcPr>
+            <w:tcW w:type="dxa" w:w="2160"/>
+          </w:tcPr>
+          <w:p>
+            <w:r>
+              <w:t>BIN/perfctrl.dll</w:t>
+            </w:r>
+          </w:p>
+        </w:tc>
+        <w:tc>
+          <w:tcPr>
+            <w:tcW w:type="dxa" w:w="2160"/>
+          </w:tcPr>
+          <w:p>
+            <w:r>
+              <w:t>Yes / Yes</w:t>
+            </w:r>
+          </w:p>
+        </w:tc>
+        <w:tc>
+          <w:tcPr>
+            <w:tcW w:type="dxa" w:w="2160"/>
+          </w:tcPr>
+          <w:p>
+            <w:r>
+              <w:t>No direct script reference found; name suggests a performance-counter control helper library, plausibly used alongside PerfMon-based data collection, not independently confirmed.</w:t>
+            </w:r>
+          </w:p>
+        </w:tc>
+        <w:tc>
+          <w:tcPr>
+            <w:tcW w:type="dxa" w:w="2160"/>
+          </w:tcPr>
+          <w:p>
+            <w:r>
+              <w:t>No direct reference found in bundled scripts (695 .ps1/.psm1 files searched)</w:t>
+            </w:r>
+          </w:p>
+        </w:tc>
+      </w:tr>
+      <w:tr>
+        <w:tc>
+          <w:tcPr>
+            <w:tcW w:type="dxa" w:w="2160"/>
+          </w:tcPr>
+          <w:p>
+            <w:r>
+              <w:t>BIN/poolmon.exe</w:t>
+            </w:r>
+          </w:p>
+        </w:tc>
+        <w:tc>
+          <w:tcPr>
+            <w:tcW w:type="dxa" w:w="2160"/>
+          </w:tcPr>
+          <w:p>
+            <w:r>
+              <w:t>Yes / Yes</w:t>
+            </w:r>
+          </w:p>
+        </w:tc>
+        <w:tc>
+          <w:tcPr>
+            <w:tcW w:type="dxa" w:w="2160"/>
+          </w:tcPr>
+          <w:p>
+            <w:r>
+              <w:t>Windows kernel pool memory usage monitor (from the WDK); gated behind a -PoolMon parameter and -noPoolMon switch (run automatically at trace start/stop unless disabled).</w:t>
+            </w:r>
+          </w:p>
+        </w:tc>
+        <w:tc>
+          <w:tcPr>
+            <w:tcW w:type="dxa" w:w="2160"/>
+          </w:tcPr>
+          <w:p>
+            <w:r>
+              <w:t>TSS.ps1:1421: [String]$PoolMon,</w:t>
+            </w:r>
+          </w:p>
+        </w:tc>
+      </w:tr>
+      <w:tr>
+        <w:tc>
+          <w:tcPr>
+            <w:tcW w:type="dxa" w:w="2160"/>
+          </w:tcPr>
+          <w:p>
+            <w:r>
+              <w:t>BIN/procdump.exe</w:t>
+            </w:r>
+          </w:p>
+        </w:tc>
+        <w:tc>
+          <w:tcPr>
+            <w:tcW w:type="dxa" w:w="2160"/>
+          </w:tcPr>
+          <w:p>
+            <w:r>
+              <w:t>Yes / Yes</w:t>
+            </w:r>
+          </w:p>
+        </w:tc>
+        <w:tc>
+          <w:tcPr>
+            <w:tcW w:type="dxa" w:w="2160"/>
+          </w:tcPr>
+          <w:p>
+            <w:r>
+              <w:t>Sysinternals ProcDump — captures process memory dumps on demand or on a trigger (e.g. crash, hang, CPU threshold); gated behind -ProcDump and -ProcDumpAppCrash parameters.</w:t>
+            </w:r>
+          </w:p>
+        </w:tc>
+        <w:tc>
+          <w:tcPr>
+            <w:tcW w:type="dxa" w:w="2160"/>
+          </w:tcPr>
+          <w:p>
+            <w:r>
+              <w:t>TSS.ps1:1687: [String[]]$ProcDump,</w:t>
+            </w:r>
+          </w:p>
+        </w:tc>
+      </w:tr>
+      <w:tr>
+        <w:tc>
+          <w:tcPr>
+            <w:tcW w:type="dxa" w:w="2160"/>
+          </w:tcPr>
+          <w:p>
+            <w:r>
+              <w:t>BIN/psping.exe</w:t>
+            </w:r>
+          </w:p>
+        </w:tc>
+        <w:tc>
+          <w:tcPr>
+            <w:tcW w:type="dxa" w:w="2160"/>
+          </w:tcPr>
+          <w:p>
+            <w:r>
+              <w:t>Yes / Yes</w:t>
+            </w:r>
+          </w:p>
+        </w:tc>
+        <w:tc>
+          <w:tcPr>
+            <w:tcW w:type="dxa" w:w="2160"/>
+          </w:tcPr>
+          <w:p>
+            <w:r>
+              <w:t>Sysinternals PsPing — TCP/ICMP latency and bandwidth testing tool; referenced as a suggested manual tool in one script and re-implemented as an inline TCP probe elsewhere, rather than directly invoked as a subprocess in the paths reviewed.</w:t>
+            </w:r>
+          </w:p>
+        </w:tc>
+        <w:tc>
+          <w:tcPr>
+            <w:tcW w:type="dxa" w:w="2160"/>
+          </w:tcPr>
+          <w:p>
+            <w:r>
+              <w:t>scripts/tss_MsDavConnection.ps1:593: else { Write-ToLog "`tUnable to determine RTT. Consider using PsPing from SysInternals to find the RTT" }</w:t>
+            </w:r>
+          </w:p>
+        </w:tc>
+      </w:tr>
+      <w:tr>
+        <w:tc>
+          <w:tcPr>
+            <w:tcW w:type="dxa" w:w="2160"/>
+          </w:tcPr>
+          <w:p>
+            <w:r>
+              <w:t>BIN/rpccfg.exe</w:t>
+            </w:r>
+          </w:p>
+        </w:tc>
+        <w:tc>
+          <w:tcPr>
+            <w:tcW w:type="dxa" w:w="2160"/>
+          </w:tcPr>
+          <w:p>
+            <w:r>
+              <w:t>Yes / Yes</w:t>
+            </w:r>
+          </w:p>
+        </w:tc>
+        <w:tc>
+          <w:tcPr>
+            <w:tcW w:type="dxa" w:w="2160"/>
+          </w:tcPr>
+          <w:p>
+            <w:r>
+              <w:t>Classic Microsoft RPC configuration tool — invoked with /l to dump RPC endpoint configuration as part of RPC diagnostic data collection in the NET module.</w:t>
+            </w:r>
+          </w:p>
+        </w:tc>
+        <w:tc>
+          <w:tcPr>
+            <w:tcW w:type="dxa" w:w="2160"/>
+          </w:tcPr>
+          <w:p>
+            <w:r>
+              <w:t>TSS_NET.psm1:4150: LogInfoFile "[$($MyInvocation.MyCommand.Name)] collecting 'RPCdump.exe /v /i, RPCcfg.exe /l, /q' infos at _Stop_"</w:t>
+            </w:r>
+          </w:p>
+        </w:tc>
+      </w:tr>
+      <w:tr>
+        <w:tc>
+          <w:tcPr>
+            <w:tcW w:type="dxa" w:w="2160"/>
+          </w:tcPr>
+          <w:p>
+            <w:r>
+              <w:t>BIN/rpcdump.exe</w:t>
+            </w:r>
+          </w:p>
+        </w:tc>
+        <w:tc>
+          <w:tcPr>
+            <w:tcW w:type="dxa" w:w="2160"/>
+          </w:tcPr>
+          <w:p>
+            <w:r>
+              <w:t>Yes / Yes</w:t>
+            </w:r>
+          </w:p>
+        </w:tc>
+        <w:tc>
+          <w:tcPr>
+            <w:tcW w:type="dxa" w:w="2160"/>
+          </w:tcPr>
+          <w:p>
+            <w:r>
+              <w:t>Classic Microsoft RPC endpoint-mapper enumeration tool — invoked with /v /i to dump registered RPC interfaces/endpoints, alongside rpccfg.exe in the same NET module diagnostic pass.</w:t>
+            </w:r>
+          </w:p>
+        </w:tc>
+        <w:tc>
+          <w:tcPr>
+            <w:tcW w:type="dxa" w:w="2160"/>
+          </w:tcPr>
+          <w:p>
+            <w:r>
+              <w:t>TSS_NET.psm1:4150: LogInfoFile "[$($MyInvocation.MyCommand.Name)] collecting 'RPCdump.exe /v /i, RPCcfg.exe /l, /q' infos at _Stop_"</w:t>
+            </w:r>
+          </w:p>
+        </w:tc>
+      </w:tr>
+      <w:tr>
+        <w:tc>
+          <w:tcPr>
+            <w:tcW w:type="dxa" w:w="2160"/>
+          </w:tcPr>
+          <w:p>
+            <w:r>
+              <w:t>BIN/windowsperformancerecordercontrol.dll</w:t>
+            </w:r>
+          </w:p>
+        </w:tc>
+        <w:tc>
+          <w:tcPr>
+            <w:tcW w:type="dxa" w:w="2160"/>
+          </w:tcPr>
+          <w:p>
+            <w:r>
+              <w:t>Yes / Yes</w:t>
+            </w:r>
+          </w:p>
+        </w:tc>
+        <w:tc>
+          <w:tcPr>
+            <w:tcW w:type="dxa" w:w="2160"/>
+          </w:tcPr>
+          <w:p>
+            <w:r>
+              <w:t>No direct script reference found; name indicates a Windows Performance Recorder (WPR) control-library component, plausibly a dependency of wpr.exe/xperf.exe tracing, not independently confirmed.</w:t>
+            </w:r>
+          </w:p>
+        </w:tc>
+        <w:tc>
+          <w:tcPr>
+            <w:tcW w:type="dxa" w:w="2160"/>
+          </w:tcPr>
+          <w:p>
+            <w:r>
+              <w:t>No direct reference found in bundled scripts (695 .ps1/.psm1 files searched)</w:t>
+            </w:r>
+          </w:p>
+        </w:tc>
+      </w:tr>
+      <w:tr>
+        <w:tc>
+          <w:tcPr>
+            <w:tcW w:type="dxa" w:w="2160"/>
+          </w:tcPr>
+          <w:p>
+            <w:r>
+              <w:t>BIN/wpr.exe</w:t>
+            </w:r>
+          </w:p>
+        </w:tc>
+        <w:tc>
+          <w:tcPr>
+            <w:tcW w:type="dxa" w:w="2160"/>
+          </w:tcPr>
+          <w:p>
+            <w:r>
+              <w:t>Yes / Yes</w:t>
+            </w:r>
+          </w:p>
+        </w:tc>
+        <w:tc>
+          <w:tcPr>
+            <w:tcW w:type="dxa" w:w="2160"/>
+          </w:tcPr>
+          <w:p>
+            <w:r>
+              <w:t>Windows Performance Recorder — ETW-based system tracing tool; orchestrated via TSS's WPR profile listing/selection logic (-ListSupportedWPRScenario, WPRprofiles parameter type) and the -WPR trace-start pathway noted earlier in this review.</w:t>
+            </w:r>
+          </w:p>
+        </w:tc>
+        <w:tc>
+          <w:tcPr>
+            <w:tcW w:type="dxa" w:w="2160"/>
+          </w:tcPr>
+          <w:p>
+            <w:r>
+              <w:t>TSSGUI.ps1:363: "&amp; `"$tssGuiPath\TSS.ps1`" -ListSupportedWPRScenario -ExportGUIcsv",</w:t>
+            </w:r>
+          </w:p>
+        </w:tc>
+      </w:tr>
+      <w:tr>
+        <w:tc>
+          <w:tcPr>
+            <w:tcW w:type="dxa" w:w="2160"/>
+          </w:tcPr>
+          <w:p>
+            <w:r>
+              <w:t>BIN/xperf.exe</w:t>
+            </w:r>
+          </w:p>
+        </w:tc>
+        <w:tc>
+          <w:tcPr>
+            <w:tcW w:type="dxa" w:w="2160"/>
+          </w:tcPr>
+          <w:p>
+            <w:r>
+              <w:t>Yes / Yes</w:t>
+            </w:r>
+          </w:p>
+        </w:tc>
+        <w:tc>
+          <w:tcPr>
+            <w:tcW w:type="dxa" w:w="2160"/>
+          </w:tcPr>
+          <w:p>
+            <w:r>
+              <w:t>Windows Performance Toolkit's xperf — ETW-based system tracing and analysis tool; orchestrated via a parallel Xperf profile listing/selection logic (-ListSupportedXperfProfile) alongside wpr.exe.</w:t>
+            </w:r>
+          </w:p>
+        </w:tc>
+        <w:tc>
+          <w:tcPr>
+            <w:tcW w:type="dxa" w:w="2160"/>
+          </w:tcPr>
+          <w:p>
+            <w:r>
+              <w:t>TSSGUI.ps1:364: "&amp; `"$tssGuiPath\TSS.ps1`" -ListSupportedXperfProfile -ExportGUIcsv"</w:t>
+            </w:r>
+          </w:p>
+        </w:tc>
+      </w:tr>
+      <w:tr>
+        <w:tc>
+          <w:tcPr>
+            <w:tcW w:type="dxa" w:w="2160"/>
+          </w:tcPr>
+          <w:p>
+            <w:r>
+              <w:t>BINARM/NTttcp.exe</w:t>
+            </w:r>
+          </w:p>
+        </w:tc>
+        <w:tc>
+          <w:tcPr>
+            <w:tcW w:type="dxa" w:w="2160"/>
+          </w:tcPr>
+          <w:p>
+            <w:r>
+              <w:t>Yes / Yes</w:t>
+            </w:r>
+          </w:p>
+        </w:tc>
+        <w:tc>
+          <w:tcPr>
+            <w:tcW w:type="dxa" w:w="2160"/>
+          </w:tcPr>
+          <w:p>
+            <w:r>
+              <w:t>Microsoft NTttcp — network throughput benchmarking tool; ARM64 build of the same tool used for network performance tests (see BINx64/BINx86 entries for command construction).</w:t>
+            </w:r>
+          </w:p>
+        </w:tc>
+        <w:tc>
+          <w:tcPr>
+            <w:tcW w:type="dxa" w:w="2160"/>
+          </w:tcPr>
+          <w:p>
+            <w:r>
+              <w:t>TSS.ps1:30424: $NtttcpSTThdCmd = $script:PerfTCPExe + " -r -m 1,*," + $PerfTCPAddr + " -p 5005 -l " + $BufferLength + "K -a 16 -t " + $DurationInSec</w:t>
+            </w:r>
+          </w:p>
+        </w:tc>
+      </w:tr>
+      <w:tr>
+        <w:tc>
+          <w:tcPr>
+            <w:tcW w:type="dxa" w:w="2160"/>
+          </w:tcPr>
+          <w:p>
+            <w:r>
+              <w:t>BINARM/ProcDump.exe</w:t>
+            </w:r>
+          </w:p>
+        </w:tc>
+        <w:tc>
+          <w:tcPr>
+            <w:tcW w:type="dxa" w:w="2160"/>
+          </w:tcPr>
+          <w:p>
+            <w:r>
+              <w:t>Yes / Yes</w:t>
+            </w:r>
+          </w:p>
+        </w:tc>
+        <w:tc>
+          <w:tcPr>
+            <w:tcW w:type="dxa" w:w="2160"/>
+          </w:tcPr>
+          <w:p>
+            <w:r>
+              <w:t>ARM64 build of Sysinternals ProcDump (see BIN/procdump.exe).</w:t>
+            </w:r>
+          </w:p>
+        </w:tc>
+        <w:tc>
+          <w:tcPr>
+            <w:tcW w:type="dxa" w:w="2160"/>
+          </w:tcPr>
+          <w:p>
+            <w:r>
+              <w:t>TSS.ps1:1687: [String[]]$ProcDump,</w:t>
+            </w:r>
+          </w:p>
+        </w:tc>
+      </w:tr>
+      <w:tr>
+        <w:tc>
+          <w:tcPr>
+            <w:tcW w:type="dxa" w:w="2160"/>
+          </w:tcPr>
+          <w:p>
+            <w:r>
+              <w:t>BINARM/Procmon.exe</w:t>
+            </w:r>
+          </w:p>
+        </w:tc>
+        <w:tc>
+          <w:tcPr>
+            <w:tcW w:type="dxa" w:w="2160"/>
+          </w:tcPr>
+          <w:p>
+            <w:r>
+              <w:t>Yes / Yes</w:t>
+            </w:r>
+          </w:p>
+        </w:tc>
+        <w:tc>
+          <w:tcPr>
+            <w:tcW w:type="dxa" w:w="2160"/>
+          </w:tcPr>
+          <w:p>
+            <w:r>
+              <w:t>ARM64 build of Sysinternals Process Monitor (see BIN/Procmon.exe).</w:t>
+            </w:r>
+          </w:p>
+        </w:tc>
+        <w:tc>
+          <w:tcPr>
+            <w:tcW w:type="dxa" w:w="2160"/>
+          </w:tcPr>
+          <w:p>
+            <w:r>
+              <w:t>TSSGUI.ps1:1930: # Change text color for lines starting with "ProcMon"</w:t>
+            </w:r>
+          </w:p>
+        </w:tc>
+      </w:tr>
+      <w:tr>
+        <w:tc>
+          <w:tcPr>
+            <w:tcW w:type="dxa" w:w="2160"/>
+          </w:tcPr>
+          <w:p>
+            <w:r>
+              <w:t>BINARM/Sysmon64a.exe</w:t>
+            </w:r>
+          </w:p>
+        </w:tc>
+        <w:tc>
+          <w:tcPr>
+            <w:tcW w:type="dxa" w:w="2160"/>
+          </w:tcPr>
+          <w:p>
+            <w:r>
+              <w:t>Yes / Yes</w:t>
+            </w:r>
+          </w:p>
+        </w:tc>
+        <w:tc>
+          <w:tcPr>
+            <w:tcW w:type="dxa" w:w="2160"/>
+          </w:tcPr>
+          <w:p>
+            <w:r>
+              <w:t>ARM64 build of Sysinternals Sysmon (see BIN/Sysmon.exe); no direct script reference found beyond architecture-specific bundling, consistent with the other ARM64 tool builds.</w:t>
+            </w:r>
+          </w:p>
+        </w:tc>
+        <w:tc>
+          <w:tcPr>
+            <w:tcW w:type="dxa" w:w="2160"/>
+          </w:tcPr>
+          <w:p>
+            <w:r>
+              <w:t>No direct reference found in bundled scripts (695 .ps1/.psm1 files searched)</w:t>
+            </w:r>
+          </w:p>
+        </w:tc>
+      </w:tr>
+      <w:tr>
+        <w:tc>
+          <w:tcPr>
+            <w:tcW w:type="dxa" w:w="2160"/>
+          </w:tcPr>
+          <w:p>
+            <w:r>
+              <w:t>BINARM/notmyfaultc.exe</w:t>
+            </w:r>
+          </w:p>
+        </w:tc>
+        <w:tc>
+          <w:tcPr>
+            <w:tcW w:type="dxa" w:w="2160"/>
+          </w:tcPr>
+          <w:p>
+            <w:r>
+              <w:t>Yes / Yes</w:t>
+            </w:r>
+          </w:p>
+        </w:tc>
+        <w:tc>
+          <w:tcPr>
+            <w:tcW w:type="dxa" w:w="2160"/>
+          </w:tcPr>
+          <w:p>
+            <w:r>
+              <w:t>ARM64 build of Sysinternals NotMyFault (see BINx64/notmyfaultc.exe).</w:t>
+            </w:r>
+          </w:p>
+        </w:tc>
+        <w:tc>
+          <w:tcPr>
+            <w:tcW w:type="dxa" w:w="2160"/>
+          </w:tcPr>
+          <w:p>
+            <w:r>
+              <w:t>TSS.ps1:5390: $NotMyFault = Get-Command $global:NotMyFaultcExe -ErrorAction Ignore</w:t>
+            </w:r>
+          </w:p>
+        </w:tc>
+      </w:tr>
+      <w:tr>
+        <w:tc>
+          <w:tcPr>
+            <w:tcW w:type="dxa" w:w="2160"/>
+          </w:tcPr>
+          <w:p>
+            <w:r>
+              <w:t>BINx64/Checksym.exe</w:t>
+            </w:r>
+          </w:p>
+        </w:tc>
+        <w:tc>
+          <w:tcPr>
+            <w:tcW w:type="dxa" w:w="2160"/>
+          </w:tcPr>
+          <w:p>
+            <w:r>
+              <w:t>Yes / Yes</w:t>
+            </w:r>
+          </w:p>
+        </w:tc>
+        <w:tc>
+          <w:tcPr>
+            <w:tcW w:type="dxa" w:w="2160"/>
+          </w:tcPr>
+          <w:p>
+            <w:r>
+              <w:t>Microsoft support tool that enumerates file versions across the local machine; invoked by a dedicated tss_ChkSym.ps1 helper script.</w:t>
+            </w:r>
+          </w:p>
+        </w:tc>
+        <w:tc>
+          <w:tcPr>
+            <w:tcW w:type="dxa" w:w="2160"/>
+          </w:tcPr>
+          <w:p>
+            <w:r>
+              <w:t>TSS.ps1:32218: $global:ChecksymExe</w:t>
+              <w:tab/>
+              <w:tab/>
+              <w:t>= $global:ScriptFolder + $BinArch + "\Checksym.exe"</w:t>
+            </w:r>
+          </w:p>
+        </w:tc>
+      </w:tr>
+      <w:tr>
+        <w:tc>
+          <w:tcPr>
+            <w:tcW w:type="dxa" w:w="2160"/>
+          </w:tcPr>
+          <w:p>
+            <w:r>
+              <w:t>BINx64/NTttcp.exe</w:t>
+            </w:r>
+          </w:p>
+        </w:tc>
+        <w:tc>
+          <w:tcPr>
+            <w:tcW w:type="dxa" w:w="2160"/>
+          </w:tcPr>
+          <w:p>
+            <w:r>
+              <w:t>Yes / Yes</w:t>
+            </w:r>
+          </w:p>
+        </w:tc>
+        <w:tc>
+          <w:tcPr>
+            <w:tcW w:type="dxa" w:w="2160"/>
+          </w:tcPr>
+          <w:p>
+            <w:r>
+              <w:t>Microsoft NTttcp — network throughput benchmarking tool; invoked with constructed single-thread/multi-thread command lines as part of performance (PRF) network test scenarios.</w:t>
+            </w:r>
+          </w:p>
+        </w:tc>
+        <w:tc>
+          <w:tcPr>
+            <w:tcW w:type="dxa" w:w="2160"/>
+          </w:tcPr>
+          <w:p>
+            <w:r>
+              <w:t>TSS.ps1:30424: $NtttcpSTThdCmd = $script:PerfTCPExe + " -r -m 1,*," + $PerfTCPAddr + " -p 5005 -l " + $BufferLength + "K -a 16 -t " + $DurationInSec</w:t>
+            </w:r>
+          </w:p>
+        </w:tc>
+      </w:tr>
+      <w:tr>
+        <w:tc>
+          <w:tcPr>
+            <w:tcW w:type="dxa" w:w="2160"/>
+          </w:tcPr>
+          <w:p>
+            <w:r>
+              <w:t>BINx64/PsGetsid.exe</w:t>
+            </w:r>
+          </w:p>
+        </w:tc>
+        <w:tc>
+          <w:tcPr>
+            <w:tcW w:type="dxa" w:w="2160"/>
+          </w:tcPr>
+          <w:p>
+            <w:r>
+              <w:t>Yes / Yes</w:t>
+            </w:r>
+          </w:p>
+        </w:tc>
+        <w:tc>
+          <w:tcPr>
+            <w:tcW w:type="dxa" w:w="2160"/>
+          </w:tcPr>
+          <w:p>
+            <w:r>
+              <w:t>Sysinternals PsGetSid — resolves/converts Windows SIDs; invoked with /AcceptEula while collecting SSHD service diagnostic info in the NET module.</w:t>
+            </w:r>
+          </w:p>
+        </w:tc>
+        <w:tc>
+          <w:tcPr>
+            <w:tcW w:type="dxa" w:w="2160"/>
+          </w:tcPr>
+          <w:p>
+            <w:r>
+              <w:t>TSS_NET.psm1:3930: LogInfoFile "... collecting sshd_Service info and running PsGetSID $_ at $global:TssPhase"</w:t>
+            </w:r>
+          </w:p>
+        </w:tc>
+      </w:tr>
+      <w:tr>
+        <w:tc>
+          <w:tcPr>
+            <w:tcW w:type="dxa" w:w="2160"/>
+          </w:tcPr>
+          <w:p>
+            <w:r>
+              <w:t>BINx64/Pstat.exe</w:t>
+            </w:r>
+          </w:p>
+        </w:tc>
+        <w:tc>
+          <w:tcPr>
+            <w:tcW w:type="dxa" w:w="2160"/>
+          </w:tcPr>
+          <w:p>
+            <w:r>
+              <w:t>Yes / Yes</w:t>
+            </w:r>
+          </w:p>
+        </w:tc>
+        <w:tc>
+          <w:tcPr>
+            <w:tcW w:type="dxa" w:w="2160"/>
+          </w:tcPr>
+          <w:p>
+            <w:r>
+              <w:t>WDK process/thread status utility; path constructed and referenced in TSS's core status-collection logic.</w:t>
+            </w:r>
+          </w:p>
+        </w:tc>
+        <w:tc>
+          <w:tcPr>
+            <w:tcW w:type="dxa" w:w="2160"/>
+          </w:tcPr>
+          <w:p>
+            <w:r>
+              <w:t>TSS.ps1:2898: if($r.Name -eq 'Instance' -and $resp.StatusCode -eq [System.Net.HttpStatusCode]::OK){</w:t>
+            </w:r>
+          </w:p>
+        </w:tc>
+      </w:tr>
+      <w:tr>
+        <w:tc>
+          <w:tcPr>
+            <w:tcW w:type="dxa" w:w="2160"/>
+          </w:tcPr>
+          <w:p>
+            <w:r>
+              <w:t>BINx64/RecorderCommandLine.exe</w:t>
+            </w:r>
+          </w:p>
+        </w:tc>
+        <w:tc>
+          <w:tcPr>
+            <w:tcW w:type="dxa" w:w="2160"/>
+          </w:tcPr>
+          <w:p>
+            <w:r>
+              <w:t>Yes / Yes</w:t>
+            </w:r>
+          </w:p>
+        </w:tc>
+        <w:tc>
+          <w:tcPr>
+            <w:tcW w:type="dxa" w:w="2160"/>
+          </w:tcPr>
+          <w:p>
+            <w:r>
+              <w:t>Command-line component of Windows Problem Steps Recorder (PSR) used for the 'Video' screen-recording data collection option named in TSS's synopsis; TSS checks for a running 'recordercommandline' process to manage recording state.</w:t>
+            </w:r>
+          </w:p>
+        </w:tc>
+        <w:tc>
+          <w:tcPr>
+            <w:tcW w:type="dxa" w:w="2160"/>
+          </w:tcPr>
+          <w:p>
+            <w:r>
+              <w:t>TSS.ps1:12152: $VideoProcess = $Processes | Where-Object{$_.Name.ToLower() -eq 'recordercommandline'}</w:t>
+            </w:r>
+          </w:p>
+        </w:tc>
+      </w:tr>
+      <w:tr>
+        <w:tc>
+          <w:tcPr>
+            <w:tcW w:type="dxa" w:w="2160"/>
+          </w:tcPr>
+          <w:p>
+            <w:r>
+              <w:t>BINx64/RecorderDll.dll</w:t>
+            </w:r>
+          </w:p>
+        </w:tc>
+        <w:tc>
+          <w:tcPr>
+            <w:tcW w:type="dxa" w:w="2160"/>
+          </w:tcPr>
+          <w:p>
+            <w:r>
+              <w:t>Yes / Yes</w:t>
+            </w:r>
+          </w:p>
+        </w:tc>
+        <w:tc>
+          <w:tcPr>
+            <w:tcW w:type="dxa" w:w="2160"/>
+          </w:tcPr>
+          <w:p>
+            <w:r>
+              <w:t>No direct script reference found; name and bundling alongside RecorderCommandLine.exe/SdkDll.dll suggest it is a supporting library for the Problem Steps Recorder component, not independently confirmed.</w:t>
+            </w:r>
+          </w:p>
+        </w:tc>
+        <w:tc>
+          <w:tcPr>
+            <w:tcW w:type="dxa" w:w="2160"/>
+          </w:tcPr>
+          <w:p>
+            <w:r>
+              <w:t>No direct reference found in bundled scripts (695 .ps1/.psm1 files searched)</w:t>
+            </w:r>
+          </w:p>
+        </w:tc>
+      </w:tr>
+      <w:tr>
+        <w:tc>
+          <w:tcPr>
+            <w:tcW w:type="dxa" w:w="2160"/>
+          </w:tcPr>
+          <w:p>
+            <w:r>
+              <w:t>BINx64/SdkDll.dll</w:t>
+            </w:r>
+          </w:p>
+        </w:tc>
+        <w:tc>
+          <w:tcPr>
+            <w:tcW w:type="dxa" w:w="2160"/>
+          </w:tcPr>
+          <w:p>
+            <w:r>
+              <w:t>Yes / Yes</w:t>
+            </w:r>
+          </w:p>
+        </w:tc>
+        <w:tc>
+          <w:tcPr>
+            <w:tcW w:type="dxa" w:w="2160"/>
+          </w:tcPr>
+          <w:p>
+            <w:r>
+              <w:t>No direct script reference found; name suggests an SDK support library, plausibly for RecorderCommandLine.exe, not independently confirmed.</w:t>
+            </w:r>
+          </w:p>
+        </w:tc>
+        <w:tc>
+          <w:tcPr>
+            <w:tcW w:type="dxa" w:w="2160"/>
+          </w:tcPr>
+          <w:p>
+            <w:r>
+              <w:t>No direct reference found in bundled scripts (695 .ps1/.psm1 files searched)</w:t>
+            </w:r>
+          </w:p>
+        </w:tc>
+      </w:tr>
+      <w:tr>
+        <w:tc>
+          <w:tcPr>
+            <w:tcW w:type="dxa" w:w="2160"/>
+          </w:tcPr>
+          <w:p>
+            <w:r>
+              <w:t>BINx64/cscdbdump.exe</w:t>
+            </w:r>
+          </w:p>
+        </w:tc>
+        <w:tc>
+          <w:tcPr>
+            <w:tcW w:type="dxa" w:w="2160"/>
+          </w:tcPr>
+          <w:p>
+            <w:r>
+              <w:t>Yes / Yes</w:t>
+            </w:r>
+          </w:p>
+        </w:tc>
+        <w:tc>
+          <w:tcPr>
+            <w:tcW w:type="dxa" w:w="2160"/>
+          </w:tcPr>
+          <w:p>
+            <w:r>
+              <w:t>Offline Files (CSC) client-side cache database dump tool; invoked to dump the CSC database as part of client-component diagnostics on client SKUs.</w:t>
+            </w:r>
+          </w:p>
+        </w:tc>
+        <w:tc>
+          <w:tcPr>
+            <w:tcW w:type="dxa" w:w="2160"/>
+          </w:tcPr>
+          <w:p>
+            <w:r>
+              <w:t>psSDP/Diag/global/DC_CscClient-Component.ps1:4: # Date: 2009-2014, 2020-10-26 WalterE added CscDbDump, run script only for Client SKU</w:t>
+            </w:r>
+          </w:p>
+        </w:tc>
+      </w:tr>
+      <w:tr>
+        <w:tc>
+          <w:tcPr>
+            <w:tcW w:type="dxa" w:w="2160"/>
+          </w:tcPr>
+          <w:p>
+            <w:r>
+              <w:t>BINx64/ctsTraffic.exe</w:t>
+            </w:r>
+          </w:p>
+        </w:tc>
+        <w:tc>
+          <w:tcPr>
+            <w:tcW w:type="dxa" w:w="2160"/>
+          </w:tcPr>
+          <w:p>
+            <w:r>
+              <w:t>Yes / Yes</w:t>
+            </w:r>
+          </w:p>
+        </w:tc>
+        <w:tc>
+          <w:tcPr>
+            <w:tcW w:type="dxa" w:w="2160"/>
+          </w:tcPr>
+          <w:p>
+            <w:r>
+              <w:t>Likely Microsoft's open-source CTS-Traffic network stress/reliability testing tool, bundled by name convention alongside other network performance tools (NTttcp, latte); no direct script invocation was found in the reviewed scripts.</w:t>
+            </w:r>
+          </w:p>
+        </w:tc>
+        <w:tc>
+          <w:tcPr>
+            <w:tcW w:type="dxa" w:w="2160"/>
+          </w:tcPr>
+          <w:p>
+            <w:r>
+              <w:t>No direct reference found in bundled scripts (695 .ps1/.psm1 files searched)</w:t>
+            </w:r>
+          </w:p>
+        </w:tc>
+      </w:tr>
+      <w:tr>
+        <w:tc>
+          <w:tcPr>
+            <w:tcW w:type="dxa" w:w="2160"/>
+          </w:tcPr>
+          <w:p>
+            <w:r>
+              <w:t>BINx64/dfsutil.exe</w:t>
+            </w:r>
+          </w:p>
+        </w:tc>
+        <w:tc>
+          <w:tcPr>
+            <w:tcW w:type="dxa" w:w="2160"/>
+          </w:tcPr>
+          <w:p>
+            <w:r>
+              <w:t>Yes / Yes</w:t>
+            </w:r>
+          </w:p>
+        </w:tc>
+        <w:tc>
+          <w:tcPr>
+            <w:tcW w:type="dxa" w:w="2160"/>
+          </w:tcPr>
+          <w:p>
+            <w:r>
+              <w:t>Distributed File System (DFS) utility; invoked with /PKTflush to flush the DFS referral cache as part of DFS diagnostics.</w:t>
+            </w:r>
+          </w:p>
+        </w:tc>
+        <w:tc>
+          <w:tcPr>
+            <w:tcW w:type="dxa" w:w="2160"/>
+          </w:tcPr>
+          <w:p>
+            <w:r>
+              <w:t>TSS.ps1:5359: if (Test-Path $DFSutilExe) {</w:t>
+            </w:r>
+          </w:p>
+        </w:tc>
+      </w:tr>
+      <w:tr>
+        <w:tc>
+          <w:tcPr>
+            <w:tcW w:type="dxa" w:w="2160"/>
+          </w:tcPr>
+          <w:p>
+            <w:r>
+              <w:t>BINx64/dpmcmd.exe</w:t>
+            </w:r>
+          </w:p>
+        </w:tc>
+        <w:tc>
+          <w:tcPr>
+            <w:tcW w:type="dxa" w:w="2160"/>
+          </w:tcPr>
+          <w:p>
+            <w:r>
+              <w:t>Yes / Yes</w:t>
+            </w:r>
+          </w:p>
+        </w:tc>
+        <w:tc>
+          <w:tcPr>
+            <w:tcW w:type="dxa" w:w="2160"/>
+          </w:tcPr>
+          <w:p>
+            <w:r>
+              <w:t>Data Protection Manager (DPM) command-line tool; invoked with 'qe all-procs-v' to enumerate DPM process queue state as part of DPM diagnostics in the NET module.</w:t>
+            </w:r>
+          </w:p>
+        </w:tc>
+        <w:tc>
+          <w:tcPr>
+            <w:tcW w:type="dxa" w:w="2160"/>
+          </w:tcPr>
+          <w:p>
+            <w:r>
+              <w:t xml:space="preserve">TSS_NET.psm1:4523: $DpmCmdPath </w:t>
+              <w:tab/>
+              <w:tab/>
+              <w:tab/>
+              <w:t>= $global:ScriptFolder + $BinArch + "\DpmCmd.exe"</w:t>
+            </w:r>
+          </w:p>
+        </w:tc>
+      </w:tr>
+      <w:tr>
+        <w:tc>
+          <w:tcPr>
+            <w:tcW w:type="dxa" w:w="2160"/>
+          </w:tcPr>
+          <w:p>
+            <w:r>
+              <w:t>BINx64/du.exe</w:t>
+            </w:r>
+          </w:p>
+        </w:tc>
+        <w:tc>
+          <w:tcPr>
+            <w:tcW w:type="dxa" w:w="2160"/>
+          </w:tcPr>
+          <w:p>
+            <w:r>
+              <w:t>Yes / Yes</w:t>
+            </w:r>
+          </w:p>
+        </w:tc>
+        <w:tc>
+          <w:tcPr>
+            <w:tcW w:type="dxa" w:w="2160"/>
+          </w:tcPr>
+          <w:p>
+            <w:r>
+              <w:t>Likely Sysinternals Du (disk usage) by name and Sysinternals-suite bundling convention, but the automated script matches were false positives (matched unrelated changelog/URL text containing the substring 'du') — no confirmed direct invocation found.</w:t>
+            </w:r>
+          </w:p>
+        </w:tc>
+        <w:tc>
+          <w:tcPr>
+            <w:tcW w:type="dxa" w:w="2160"/>
+          </w:tcPr>
+          <w:p>
+            <w:r>
+              <w:t>TSSGUI.ps1:28: ::  2024.11.01.0 [rk] _GUI: Code optimization, localization updates and new languages added: Czech, Dutch, Hindi, Portuguese, Turkish.</w:t>
+            </w:r>
+          </w:p>
+        </w:tc>
+      </w:tr>
+      <w:tr>
+        <w:tc>
+          <w:tcPr>
+            <w:tcW w:type="dxa" w:w="2160"/>
+          </w:tcPr>
+          <w:p>
+            <w:r>
+              <w:t>BINx64/evparse.exe</w:t>
+            </w:r>
+          </w:p>
+        </w:tc>
+        <w:tc>
+          <w:tcPr>
+            <w:tcW w:type="dxa" w:w="2160"/>
+          </w:tcPr>
+          <w:p>
+            <w:r>
+              <w:t>Yes / Yes</w:t>
+            </w:r>
+          </w:p>
+        </w:tc>
+        <w:tc>
+          <w:tcPr>
+            <w:tcW w:type="dxa" w:w="2160"/>
+          </w:tcPr>
+          <w:p>
+            <w:r>
+              <w:t>Event log parser utility ('EvParse') — invoked via a companion DC_EvParser.ps1 script to parse storage-related System log events into an HTML report.</w:t>
+            </w:r>
+          </w:p>
+        </w:tc>
+        <w:tc>
+          <w:tcPr>
+            <w:tcW w:type="dxa" w:w="2160"/>
+          </w:tcPr>
+          <w:p>
+            <w:r>
+              <w:t>psSDP/Diag/global/TS_AutoAddCommands_VSS.ps1:58: # Parse Storage related event logs on System log using evParse.exe and dump to a HTML file</w:t>
+            </w:r>
+          </w:p>
+        </w:tc>
+      </w:tr>
+      <w:tr>
+        <w:tc>
+          <w:tcPr>
+            <w:tcW w:type="dxa" w:w="2160"/>
+          </w:tcPr>
+          <w:p>
+            <w:r>
+              <w:t>BINx64/fcinfo.exe</w:t>
+            </w:r>
+          </w:p>
+        </w:tc>
+        <w:tc>
+          <w:tcPr>
+            <w:tcW w:type="dxa" w:w="2160"/>
+          </w:tcPr>
+          <w:p>
+            <w:r>
+              <w:t>Yes / Yes</w:t>
+            </w:r>
+          </w:p>
+        </w:tc>
+        <w:tc>
+          <w:tcPr>
+            <w:tcW w:type="dxa" w:w="2160"/>
+          </w:tcPr>
+          <w:p>
+            <w:r>
+              <w:t>Fibre Channel Information utility (from the WDK) — invoked via a companion DC_FCInfo.ps1 script to collect Fibre Channel HBA/adapter information.</w:t>
+            </w:r>
+          </w:p>
+        </w:tc>
+        <w:tc>
+          <w:tcPr>
+            <w:tcW w:type="dxa" w:w="2160"/>
+          </w:tcPr>
+          <w:p>
+            <w:r>
+              <w:t>psSDP/Diag/global/TS_AutoAddCommands_VSS.ps1:49: # Collects Fiber Channel information using fcinfo utility</w:t>
+            </w:r>
+          </w:p>
+        </w:tc>
+      </w:tr>
+      <w:tr>
+        <w:tc>
+          <w:tcPr>
+            <w:tcW w:type="dxa" w:w="2160"/>
+          </w:tcPr>
+          <w:p>
+            <w:r>
+              <w:t>BINx64/hbaapi.dll</w:t>
+            </w:r>
+          </w:p>
+        </w:tc>
+        <w:tc>
+          <w:tcPr>
+            <w:tcW w:type="dxa" w:w="2160"/>
+          </w:tcPr>
+          <w:p>
+            <w:r>
+              <w:t>Yes / Yes</w:t>
+            </w:r>
+          </w:p>
+        </w:tc>
+        <w:tc>
+          <w:tcPr>
+            <w:tcW w:type="dxa" w:w="2160"/>
+          </w:tcPr>
+          <w:p>
+            <w:r>
+              <w:t>Fibre Channel HBA API library, a runtime dependency of fcinfo.exe; referenced/renamed per-architecture by the FCInfo collection script.</w:t>
+            </w:r>
+          </w:p>
+        </w:tc>
+        <w:tc>
+          <w:tcPr>
+            <w:tcW w:type="dxa" w:w="2160"/>
+          </w:tcPr>
+          <w:p>
+            <w:r>
+              <w:t>psSDP/Diag/global/DC_FCInfo.ps1:16: #_# Rename-Item -Path "hbaapi_$ProcArc.dll" -NewName "hbaapi.dll"</w:t>
+            </w:r>
+          </w:p>
+        </w:tc>
+      </w:tr>
+      <w:tr>
+        <w:tc>
+          <w:tcPr>
+            <w:tcW w:type="dxa" w:w="2160"/>
+          </w:tcPr>
+          <w:p>
+            <w:r>
+              <w:t>BINx64/hbatapi.dll</w:t>
+            </w:r>
+          </w:p>
+        </w:tc>
+        <w:tc>
+          <w:tcPr>
+            <w:tcW w:type="dxa" w:w="2160"/>
+          </w:tcPr>
+          <w:p>
+            <w:r>
+              <w:t>Yes / Yes</w:t>
+            </w:r>
+          </w:p>
+        </w:tc>
+        <w:tc>
+          <w:tcPr>
+            <w:tcW w:type="dxa" w:w="2160"/>
+          </w:tcPr>
+          <w:p>
+            <w:r>
+              <w:t>Fibre Channel HBA test/trace API library, bundled alongside hbaapi.dll as a dependency of fcinfo.exe.</w:t>
+            </w:r>
+          </w:p>
+        </w:tc>
+        <w:tc>
+          <w:tcPr>
+            <w:tcW w:type="dxa" w:w="2160"/>
+          </w:tcPr>
+          <w:p>
+            <w:r>
+              <w:t>psSDP/Diag/global/DC_FCInfo.ps1:17: #_# Rename-Item -Path "hbatapi_$ProcArc.dll" -NewName "hbatapi.dll"</w:t>
+            </w:r>
+          </w:p>
+        </w:tc>
+      </w:tr>
+      <w:tr>
+        <w:tc>
+          <w:tcPr>
+            <w:tcW w:type="dxa" w:w="2160"/>
+          </w:tcPr>
+          <w:p>
+            <w:r>
+              <w:t>BINx64/kdbgctrl.exe</w:t>
+            </w:r>
+          </w:p>
+        </w:tc>
+        <w:tc>
+          <w:tcPr>
+            <w:tcW w:type="dxa" w:w="2160"/>
+          </w:tcPr>
+          <w:p>
+            <w:r>
+              <w:t>Yes / Yes</w:t>
+            </w:r>
+          </w:p>
+        </w:tc>
+        <w:tc>
+          <w:tcPr>
+            <w:tcW w:type="dxa" w:w="2160"/>
+          </w:tcPr>
+          <w:p>
+            <w:r>
+              <w:t>Kernel debugger control utility — used to query/resize the page file based on dump-type configuration ahead of kernel dump collection.</w:t>
+            </w:r>
+          </w:p>
+        </w:tc>
+        <w:tc>
+          <w:tcPr>
+            <w:tcW w:type="dxa" w:w="2160"/>
+          </w:tcPr>
+          <w:p>
+            <w:r>
+              <w:t>TSS.ps1:14644: If(Test-Path $global:kdbgctrlExe) {</w:t>
+            </w:r>
+          </w:p>
+        </w:tc>
+      </w:tr>
+      <w:tr>
+        <w:tc>
+          <w:tcPr>
+            <w:tcW w:type="dxa" w:w="2160"/>
+          </w:tcPr>
+          <w:p>
+            <w:r>
+              <w:t>BINx64/latte.exe</w:t>
+            </w:r>
+          </w:p>
+        </w:tc>
+        <w:tc>
+          <w:tcPr>
+            <w:tcW w:type="dxa" w:w="2160"/>
+          </w:tcPr>
+          <w:p>
+            <w:r>
+              <w:t>Yes / Yes</w:t>
+            </w:r>
+          </w:p>
+        </w:tc>
+        <w:tc>
+          <w:tcPr>
+            <w:tcW w:type="dxa" w:w="2160"/>
+          </w:tcPr>
+          <w:p>
+            <w:r>
+              <w:t>Microsoft Latte — low-latency network round-trip benchmarking tool; invoked with a constructed target address/port as part of network performance test scenarios.</w:t>
+            </w:r>
+          </w:p>
+        </w:tc>
+        <w:tc>
+          <w:tcPr>
+            <w:tcW w:type="dxa" w:w="2160"/>
+          </w:tcPr>
+          <w:p>
+            <w:r>
+              <w:t>TSS.ps1:12626: # Cut out the latter part to combine later</w:t>
+            </w:r>
+          </w:p>
+        </w:tc>
+      </w:tr>
+      <w:tr>
+        <w:tc>
+          <w:tcPr>
+            <w:tcW w:type="dxa" w:w="2160"/>
+          </w:tcPr>
+          <w:p>
+            <w:r>
+              <w:t>BINx64/notmyfaultc.exe</w:t>
+            </w:r>
+          </w:p>
+        </w:tc>
+        <w:tc>
+          <w:tcPr>
+            <w:tcW w:type="dxa" w:w="2160"/>
+          </w:tcPr>
+          <w:p>
+            <w:r>
+              <w:t>Yes / Yes</w:t>
+            </w:r>
+          </w:p>
+        </w:tc>
+        <w:tc>
+          <w:tcPr>
+            <w:tcW w:type="dxa" w:w="2160"/>
+          </w:tcPr>
+          <w:p>
+            <w:r>
+              <w:t>Sysinternals NotMyFault (console build) — deliberately induces a crash, hang, or leak for testing crash-dump collection; TSS checks for its presence via Get-Command before offering it as a test-fault trigger.</w:t>
+            </w:r>
+          </w:p>
+        </w:tc>
+        <w:tc>
+          <w:tcPr>
+            <w:tcW w:type="dxa" w:w="2160"/>
+          </w:tcPr>
+          <w:p>
+            <w:r>
+              <w:t>TSS.ps1:5390: $NotMyFault = Get-Command $global:NotMyFaultcExe -ErrorAction Ignore</w:t>
+            </w:r>
+          </w:p>
+        </w:tc>
+      </w:tr>
+      <w:tr>
+        <w:tc>
+          <w:tcPr>
+            <w:tcW w:type="dxa" w:w="2160"/>
+          </w:tcPr>
+          <w:p>
+            <w:r>
+              <w:t>BINx64/poolmon.exe</w:t>
+            </w:r>
+          </w:p>
+        </w:tc>
+        <w:tc>
+          <w:tcPr>
+            <w:tcW w:type="dxa" w:w="2160"/>
+          </w:tcPr>
+          <w:p>
+            <w:r>
+              <w:t>Yes / Yes</w:t>
+            </w:r>
+          </w:p>
+        </w:tc>
+        <w:tc>
+          <w:tcPr>
+            <w:tcW w:type="dxa" w:w="2160"/>
+          </w:tcPr>
+          <w:p>
+            <w:r>
+              <w:t>Windows kernel pool memory usage monitor (see BIN/poolmon.exe); x64 build, gated by the same -PoolMon/-noPoolMon controls.</w:t>
+            </w:r>
+          </w:p>
+        </w:tc>
+        <w:tc>
+          <w:tcPr>
+            <w:tcW w:type="dxa" w:w="2160"/>
+          </w:tcPr>
+          <w:p>
+            <w:r>
+              <w:t>TSS.ps1:1421: [String]$PoolMon,</w:t>
+            </w:r>
+          </w:p>
+        </w:tc>
+      </w:tr>
+      <w:tr>
+        <w:tc>
+          <w:tcPr>
+            <w:tcW w:type="dxa" w:w="2160"/>
+          </w:tcPr>
+          <w:p>
+            <w:r>
+              <w:t>BINx64/tmq.exe</w:t>
+            </w:r>
+          </w:p>
+        </w:tc>
+        <w:tc>
+          <w:tcPr>
+            <w:tcW w:type="dxa" w:w="2160"/>
+          </w:tcPr>
+          <w:p>
+            <w:r>
+              <w:t>Yes / Yes</w:t>
+            </w:r>
+          </w:p>
+        </w:tc>
+        <w:tc>
+          <w:tcPr>
+            <w:tcW w:type="dxa" w:w="2160"/>
+          </w:tcPr>
+          <w:p>
+            <w:r>
+              <w:t>No confirmed direct script reference (the one substring match found was inside an unrelated base64-encoded certificate blob, a false positive); by naming convention alongside tmqsite/tmqstate/tmqstore/tmqtry, likely part of an MSMQ (Microsoft Message Queuing) diagnostic/test toolset.</w:t>
+            </w:r>
+          </w:p>
+        </w:tc>
+        <w:tc>
+          <w:tcPr>
+            <w:tcW w:type="dxa" w:w="2160"/>
+          </w:tcPr>
+          <w:p>
+            <w:r>
+              <w:t>scripts/Wmi-Collect.ps1:1466: # MASAAgH0oIHZpIHWMIHTMQswCQYDVQQGEwJVUzETMBEGA1UECBMKV2FzaGluZ3Rv</w:t>
+            </w:r>
+          </w:p>
+        </w:tc>
+      </w:tr>
+      <w:tr>
+        <w:tc>
+          <w:tcPr>
+            <w:tcW w:type="dxa" w:w="2160"/>
+          </w:tcPr>
+          <w:p>
+            <w:r>
+              <w:t>BINx64/tmqsite.dll</w:t>
+            </w:r>
+          </w:p>
+        </w:tc>
+        <w:tc>
+          <w:tcPr>
+            <w:tcW w:type="dxa" w:w="2160"/>
+          </w:tcPr>
+          <w:p>
+            <w:r>
+              <w:t>Yes / Yes</w:t>
+            </w:r>
+          </w:p>
+        </w:tc>
+        <w:tc>
+          <w:tcPr>
+            <w:tcW w:type="dxa" w:w="2160"/>
+          </w:tcPr>
+          <w:p>
+            <w:r>
+              <w:t>No direct script reference found; by naming convention, likely a supporting library for the tmq.exe MSMQ diagnostic toolset.</w:t>
+            </w:r>
+          </w:p>
+        </w:tc>
+        <w:tc>
+          <w:tcPr>
+            <w:tcW w:type="dxa" w:w="2160"/>
+          </w:tcPr>
+          <w:p>
+            <w:r>
+              <w:t>No direct reference found in bundled scripts (695 .ps1/.psm1 files searched)</w:t>
+            </w:r>
+          </w:p>
+        </w:tc>
+      </w:tr>
+      <w:tr>
+        <w:tc>
+          <w:tcPr>
+            <w:tcW w:type="dxa" w:w="2160"/>
+          </w:tcPr>
+          <w:p>
+            <w:r>
+              <w:t>BINx64/tmqstate.dll</w:t>
+            </w:r>
+          </w:p>
+        </w:tc>
+        <w:tc>
+          <w:tcPr>
+            <w:tcW w:type="dxa" w:w="2160"/>
+          </w:tcPr>
+          <w:p>
+            <w:r>
+              <w:t>Yes / Yes</w:t>
+            </w:r>
+          </w:p>
+        </w:tc>
+        <w:tc>
+          <w:tcPr>
+            <w:tcW w:type="dxa" w:w="2160"/>
+          </w:tcPr>
+          <w:p>
+            <w:r>
+              <w:t>Referenced when building an output filename for 'tmqstate' diagnostic data in the INT (integration/messaging) module — consistent with an MSMQ state-inspection component.</w:t>
+            </w:r>
+          </w:p>
+        </w:tc>
+        <w:tc>
+          <w:tcPr>
+            <w:tcW w:type="dxa" w:w="2160"/>
+          </w:tcPr>
+          <w:p>
+            <w:r>
+              <w:t>TSS_INT.psm1:238: $outFile = $PrefixTime + "tmqstate" + $TssPhase + ".txt"</w:t>
+            </w:r>
+          </w:p>
+        </w:tc>
+      </w:tr>
+      <w:tr>
+        <w:tc>
+          <w:tcPr>
+            <w:tcW w:type="dxa" w:w="2160"/>
+          </w:tcPr>
+          <w:p>
+            <w:r>
+              <w:t>BINx64/tmqstore.dll</w:t>
+            </w:r>
+          </w:p>
+        </w:tc>
+        <w:tc>
+          <w:tcPr>
+            <w:tcW w:type="dxa" w:w="2160"/>
+          </w:tcPr>
+          <w:p>
+            <w:r>
+              <w:t>Yes / Yes</w:t>
+            </w:r>
+          </w:p>
+        </w:tc>
+        <w:tc>
+          <w:tcPr>
+            <w:tcW w:type="dxa" w:w="2160"/>
+          </w:tcPr>
+          <w:p>
+            <w:r>
+              <w:t>No direct script reference found; by naming convention, likely a supporting library for the tmq.exe MSMQ diagnostic toolset (message store component).</w:t>
+            </w:r>
+          </w:p>
+        </w:tc>
+        <w:tc>
+          <w:tcPr>
+            <w:tcW w:type="dxa" w:w="2160"/>
+          </w:tcPr>
+          <w:p>
+            <w:r>
+              <w:t>No direct reference found in bundled scripts (695 .ps1/.psm1 files searched)</w:t>
+            </w:r>
+          </w:p>
+        </w:tc>
+      </w:tr>
+      <w:tr>
+        <w:tc>
+          <w:tcPr>
+            <w:tcW w:type="dxa" w:w="2160"/>
+          </w:tcPr>
+          <w:p>
+            <w:r>
+              <w:t>BINx64/tmqtry.dll</w:t>
+            </w:r>
+          </w:p>
+        </w:tc>
+        <w:tc>
+          <w:tcPr>
+            <w:tcW w:type="dxa" w:w="2160"/>
+          </w:tcPr>
+          <w:p>
+            <w:r>
+              <w:t>Yes / Yes</w:t>
+            </w:r>
+          </w:p>
+        </w:tc>
+        <w:tc>
+          <w:tcPr>
+            <w:tcW w:type="dxa" w:w="2160"/>
+          </w:tcPr>
+          <w:p>
+            <w:r>
+              <w:t>No direct script reference found; by naming convention, likely a supporting library for the tmq.exe MSMQ diagnostic toolset (connectivity-try component).</w:t>
+            </w:r>
+          </w:p>
+        </w:tc>
+        <w:tc>
+          <w:tcPr>
+            <w:tcW w:type="dxa" w:w="2160"/>
+          </w:tcPr>
+          <w:p>
+            <w:r>
+              <w:t>No direct reference found in bundled scripts (695 .ps1/.psm1 files searched)</w:t>
+            </w:r>
+          </w:p>
+        </w:tc>
+      </w:tr>
+      <w:tr>
+        <w:tc>
+          <w:tcPr>
+            <w:tcW w:type="dxa" w:w="2160"/>
+          </w:tcPr>
+          <w:p>
+            <w:r>
+              <w:t>BINx64/vshadow.exe</w:t>
+            </w:r>
+          </w:p>
+        </w:tc>
+        <w:tc>
+          <w:tcPr>
+            <w:tcW w:type="dxa" w:w="2160"/>
+          </w:tcPr>
+          <w:p>
+            <w:r>
+              <w:t>Yes / Yes</w:t>
+            </w:r>
+          </w:p>
+        </w:tc>
+        <w:tc>
+          <w:tcPr>
+            <w:tcW w:type="dxa" w:w="2160"/>
+          </w:tcPr>
+          <w:p>
+            <w:r>
+              <w:t>Microsoft VShadow (VSS test/requestor tool from the WDK) — invoked with -wm2 to dump Volume Shadow Copy metadata writer information.</w:t>
+            </w:r>
+          </w:p>
+        </w:tc>
+        <w:tc>
+          <w:tcPr>
+            <w:tcW w:type="dxa" w:w="2160"/>
+          </w:tcPr>
+          <w:p>
+            <w:r>
+              <w:t>psSDP/Diag/global/DC_GetSystemInfo.ps1:46: "VShadow/DiskShadow Metadata Writers output" | Out-File $OutputBase -append</w:t>
+            </w:r>
+          </w:p>
+        </w:tc>
+      </w:tr>
+      <w:tr>
+        <w:tc>
+          <w:tcPr>
+            <w:tcW w:type="dxa" w:w="2160"/>
+          </w:tcPr>
+          <w:p>
+            <w:r>
+              <w:t>BINx64/vssagent.exe</w:t>
+            </w:r>
+          </w:p>
+        </w:tc>
+        <w:tc>
+          <w:tcPr>
+            <w:tcW w:type="dxa" w:w="2160"/>
+          </w:tcPr>
+          <w:p>
+            <w:r>
+              <w:t>Yes / Yes</w:t>
+            </w:r>
+          </w:p>
+        </w:tc>
+        <w:tc>
+          <w:tcPr>
+            <w:tcW w:type="dxa" w:w="2160"/>
+          </w:tcPr>
+          <w:p>
+            <w:r>
+              <w:t>No direct script reference found; by naming convention, a Volume Shadow Copy Service (VSS) agent/writer test component bundled alongside vshadow.exe and vsstrace.exe.</w:t>
+            </w:r>
+          </w:p>
+        </w:tc>
+        <w:tc>
+          <w:tcPr>
+            <w:tcW w:type="dxa" w:w="2160"/>
+          </w:tcPr>
+          <w:p>
+            <w:r>
+              <w:t>No direct reference found in bundled scripts (695 .ps1/.psm1 files searched)</w:t>
+            </w:r>
+          </w:p>
+        </w:tc>
+      </w:tr>
+      <w:tr>
+        <w:tc>
+          <w:tcPr>
+            <w:tcW w:type="dxa" w:w="2160"/>
+          </w:tcPr>
+          <w:p>
+            <w:r>
+              <w:t>BINx64/vsstrace.exe</w:t>
+            </w:r>
+          </w:p>
+        </w:tc>
+        <w:tc>
+          <w:tcPr>
+            <w:tcW w:type="dxa" w:w="2160"/>
+          </w:tcPr>
+          <w:p>
+            <w:r>
+              <w:t>Yes / Yes</w:t>
+            </w:r>
+          </w:p>
+        </w:tc>
+        <w:tc>
+          <w:tcPr>
+            <w:tcW w:type="dxa" w:w="2160"/>
+          </w:tcPr>
+          <w:p>
+            <w:r>
+              <w:t>Volume Shadow Copy Service (VSS) tracing tool; its associated ETW trace provider GUID (VSSTraceLogProvider) is registered in the storage (SHA) module.</w:t>
+            </w:r>
+          </w:p>
+        </w:tc>
+        <w:tc>
+          <w:tcPr>
+            <w:tcW w:type="dxa" w:w="2160"/>
+          </w:tcPr>
+          <w:p>
+            <w:r>
+              <w:t>TSS_SHA.psm1:540: '{9122168F-2432-45F0-B91C-3AF363C149DD}' # VSSTraceLogProvider</w:t>
+            </w:r>
+          </w:p>
+        </w:tc>
+      </w:tr>
+      <w:tr>
+        <w:tc>
+          <w:tcPr>
+            <w:tcW w:type="dxa" w:w="2160"/>
+          </w:tcPr>
+          <w:p>
+            <w:r>
+              <w:t>BINx64/xbootmgr.exe</w:t>
+            </w:r>
+          </w:p>
+        </w:tc>
+        <w:tc>
+          <w:tcPr>
+            <w:tcW w:type="dxa" w:w="2160"/>
+          </w:tcPr>
+          <w:p>
+            <w:r>
+              <w:t>Yes / Yes</w:t>
+            </w:r>
+          </w:p>
+        </w:tc>
+        <w:tc>
+          <w:tcPr>
+            <w:tcW w:type="dxa" w:w="2160"/>
+          </w:tcPr>
+          <w:p>
+            <w:r>
+              <w:t>Windows boot/shutdown performance tracing tool (predecessor to WPR's boot-trace functionality); no direct script reference was found, consistent with it being a legacy/optional tool retained for older-OS compatibility.</w:t>
+            </w:r>
+          </w:p>
+        </w:tc>
+        <w:tc>
+          <w:tcPr>
+            <w:tcW w:type="dxa" w:w="2160"/>
+          </w:tcPr>
+          <w:p>
+            <w:r>
+              <w:t>No direct reference found in bundled scripts (695 .ps1/.psm1 files searched)</w:t>
+            </w:r>
+          </w:p>
+        </w:tc>
+      </w:tr>
+      <w:tr>
+        <w:tc>
+          <w:tcPr>
+            <w:tcW w:type="dxa" w:w="2160"/>
+          </w:tcPr>
+          <w:p>
+            <w:r>
+              <w:t>BINx86/Checksym.exe</w:t>
+            </w:r>
+          </w:p>
+        </w:tc>
+        <w:tc>
+          <w:tcPr>
+            <w:tcW w:type="dxa" w:w="2160"/>
+          </w:tcPr>
+          <w:p>
+            <w:r>
+              <w:t>Yes / Yes</w:t>
+            </w:r>
+          </w:p>
+        </w:tc>
+        <w:tc>
+          <w:tcPr>
+            <w:tcW w:type="dxa" w:w="2160"/>
+          </w:tcPr>
+          <w:p>
+            <w:r>
+              <w:t>32-bit build of the file-version enumeration tool (see BINx64/Checksym.exe).</w:t>
+            </w:r>
+          </w:p>
+        </w:tc>
+        <w:tc>
+          <w:tcPr>
+            <w:tcW w:type="dxa" w:w="2160"/>
+          </w:tcPr>
+          <w:p>
+            <w:r>
+              <w:t>TSS.ps1:32218: $global:ChecksymExe</w:t>
+              <w:tab/>
+              <w:tab/>
+              <w:t>= $global:ScriptFolder + $BinArch + "\Checksym.exe"</w:t>
+            </w:r>
+          </w:p>
+        </w:tc>
+      </w:tr>
+      <w:tr>
+        <w:tc>
+          <w:tcPr>
+            <w:tcW w:type="dxa" w:w="2160"/>
+          </w:tcPr>
+          <w:p>
+            <w:r>
+              <w:t>BINx86/NTttcp.exe</w:t>
+            </w:r>
+          </w:p>
+        </w:tc>
+        <w:tc>
+          <w:tcPr>
+            <w:tcW w:type="dxa" w:w="2160"/>
+          </w:tcPr>
+          <w:p>
+            <w:r>
+              <w:t>Yes / Yes</w:t>
+            </w:r>
+          </w:p>
+        </w:tc>
+        <w:tc>
+          <w:tcPr>
+            <w:tcW w:type="dxa" w:w="2160"/>
+          </w:tcPr>
+          <w:p>
+            <w:r>
+              <w:t>32-bit build of the NTttcp network throughput benchmarking tool (see BINx64/NTttcp.exe).</w:t>
+            </w:r>
+          </w:p>
+        </w:tc>
+        <w:tc>
+          <w:tcPr>
+            <w:tcW w:type="dxa" w:w="2160"/>
+          </w:tcPr>
+          <w:p>
+            <w:r>
+              <w:t>TSS.ps1:30424: $NtttcpSTThdCmd = $script:PerfTCPExe + " -r -m 1,*," + $PerfTCPAddr + " -p 5005 -l " + $BufferLength + "K -a 16 -t " + $DurationInSec</w:t>
+            </w:r>
+          </w:p>
+        </w:tc>
+      </w:tr>
+      <w:tr>
+        <w:tc>
+          <w:tcPr>
+            <w:tcW w:type="dxa" w:w="2160"/>
+          </w:tcPr>
+          <w:p>
+            <w:r>
+              <w:t>BINx86/PsGetsid.exe</w:t>
+            </w:r>
+          </w:p>
+        </w:tc>
+        <w:tc>
+          <w:tcPr>
+            <w:tcW w:type="dxa" w:w="2160"/>
+          </w:tcPr>
+          <w:p>
+            <w:r>
+              <w:t>Yes / Yes</w:t>
+            </w:r>
+          </w:p>
+        </w:tc>
+        <w:tc>
+          <w:tcPr>
+            <w:tcW w:type="dxa" w:w="2160"/>
+          </w:tcPr>
+          <w:p>
+            <w:r>
+              <w:t>32-bit build of Sysinternals PsGetSid (see BINx64/PsGetsid.exe).</w:t>
+            </w:r>
+          </w:p>
+        </w:tc>
+        <w:tc>
+          <w:tcPr>
+            <w:tcW w:type="dxa" w:w="2160"/>
+          </w:tcPr>
+          <w:p>
+            <w:r>
+              <w:t>TSS_NET.psm1:3930: LogInfoFile "... collecting sshd_Service info and running PsGetSID $_ at $global:TssPhase"</w:t>
+            </w:r>
+          </w:p>
+        </w:tc>
+      </w:tr>
+      <w:tr>
+        <w:tc>
+          <w:tcPr>
+            <w:tcW w:type="dxa" w:w="2160"/>
+          </w:tcPr>
+          <w:p>
+            <w:r>
+              <w:t>BINx86/Pstat.exe</w:t>
+            </w:r>
+          </w:p>
+        </w:tc>
+        <w:tc>
+          <w:tcPr>
+            <w:tcW w:type="dxa" w:w="2160"/>
+          </w:tcPr>
+          <w:p>
+            <w:r>
+              <w:t>Yes / Yes</w:t>
+            </w:r>
+          </w:p>
+        </w:tc>
+        <w:tc>
+          <w:tcPr>
+            <w:tcW w:type="dxa" w:w="2160"/>
+          </w:tcPr>
+          <w:p>
+            <w:r>
+              <w:t>32-bit build of the WDK process/thread status utility (see BINx64/Pstat.exe).</w:t>
+            </w:r>
+          </w:p>
+        </w:tc>
+        <w:tc>
+          <w:tcPr>
+            <w:tcW w:type="dxa" w:w="2160"/>
+          </w:tcPr>
+          <w:p>
+            <w:r>
+              <w:t>TSS.ps1:2898: if($r.Name -eq 'Instance' -and $resp.StatusCode -eq [System.Net.HttpStatusCode]::OK){</w:t>
+            </w:r>
+          </w:p>
+        </w:tc>
+      </w:tr>
+      <w:tr>
+        <w:tc>
+          <w:tcPr>
+            <w:tcW w:type="dxa" w:w="2160"/>
+          </w:tcPr>
+          <w:p>
+            <w:r>
+              <w:t>BINx86/RecorderCommandLine.exe</w:t>
+            </w:r>
+          </w:p>
+        </w:tc>
+        <w:tc>
+          <w:tcPr>
+            <w:tcW w:type="dxa" w:w="2160"/>
+          </w:tcPr>
+          <w:p>
+            <w:r>
+              <w:t>Yes / Yes</w:t>
+            </w:r>
+          </w:p>
+        </w:tc>
+        <w:tc>
+          <w:tcPr>
+            <w:tcW w:type="dxa" w:w="2160"/>
+          </w:tcPr>
+          <w:p>
+            <w:r>
+              <w:t>32-bit build of the Problem Steps Recorder command-line component (see BINx64/RecorderCommandLine.exe).</w:t>
+            </w:r>
+          </w:p>
+        </w:tc>
+        <w:tc>
+          <w:tcPr>
+            <w:tcW w:type="dxa" w:w="2160"/>
+          </w:tcPr>
+          <w:p>
+            <w:r>
+              <w:t>TSS.ps1:12152: $VideoProcess = $Processes | Where-Object{$_.Name.ToLower() -eq 'recordercommandline'}</w:t>
+            </w:r>
+          </w:p>
+        </w:tc>
+      </w:tr>
+      <w:tr>
+        <w:tc>
+          <w:tcPr>
+            <w:tcW w:type="dxa" w:w="2160"/>
+          </w:tcPr>
+          <w:p>
+            <w:r>
+              <w:t>BINx86/RecorderDll.dll</w:t>
+            </w:r>
+          </w:p>
+        </w:tc>
+        <w:tc>
+          <w:tcPr>
+            <w:tcW w:type="dxa" w:w="2160"/>
+          </w:tcPr>
+          <w:p>
+            <w:r>
+              <w:t>Yes / Yes</w:t>
+            </w:r>
+          </w:p>
+        </w:tc>
+        <w:tc>
+          <w:tcPr>
+            <w:tcW w:type="dxa" w:w="2160"/>
+          </w:tcPr>
+          <w:p>
+            <w:r>
+              <w:t>32-bit build of the Recorder support library (see BINx64/RecorderDll.dll); not independently confirmed.</w:t>
+            </w:r>
+          </w:p>
+        </w:tc>
+        <w:tc>
+          <w:tcPr>
+            <w:tcW w:type="dxa" w:w="2160"/>
+          </w:tcPr>
+          <w:p>
+            <w:r>
+              <w:t>No direct reference found in bundled scripts (695 .ps1/.psm1 files searched)</w:t>
+            </w:r>
+          </w:p>
+        </w:tc>
+      </w:tr>
+      <w:tr>
+        <w:tc>
+          <w:tcPr>
+            <w:tcW w:type="dxa" w:w="2160"/>
+          </w:tcPr>
+          <w:p>
+            <w:r>
+              <w:t>BINx86/SdkDll.dll</w:t>
+            </w:r>
+          </w:p>
+        </w:tc>
+        <w:tc>
+          <w:tcPr>
+            <w:tcW w:type="dxa" w:w="2160"/>
+          </w:tcPr>
+          <w:p>
+            <w:r>
+              <w:t>Yes / Yes</w:t>
+            </w:r>
+          </w:p>
+        </w:tc>
+        <w:tc>
+          <w:tcPr>
+            <w:tcW w:type="dxa" w:w="2160"/>
+          </w:tcPr>
+          <w:p>
+            <w:r>
+              <w:t>32-bit build of the SDK support library (see BINx64/SdkDll.dll); not independently confirmed.</w:t>
+            </w:r>
+          </w:p>
+        </w:tc>
+        <w:tc>
+          <w:tcPr>
+            <w:tcW w:type="dxa" w:w="2160"/>
+          </w:tcPr>
+          <w:p>
+            <w:r>
+              <w:t>No direct reference found in bundled scripts (695 .ps1/.psm1 files searched)</w:t>
+            </w:r>
+          </w:p>
+        </w:tc>
+      </w:tr>
+      <w:tr>
+        <w:tc>
+          <w:tcPr>
+            <w:tcW w:type="dxa" w:w="2160"/>
+          </w:tcPr>
+          <w:p>
+            <w:r>
+              <w:t>BINx86/cscdbdump.exe</w:t>
+            </w:r>
+          </w:p>
+        </w:tc>
+        <w:tc>
+          <w:tcPr>
+            <w:tcW w:type="dxa" w:w="2160"/>
+          </w:tcPr>
+          <w:p>
+            <w:r>
+              <w:t>Yes / Yes</w:t>
+            </w:r>
+          </w:p>
+        </w:tc>
+        <w:tc>
+          <w:tcPr>
+            <w:tcW w:type="dxa" w:w="2160"/>
+          </w:tcPr>
+          <w:p>
+            <w:r>
+              <w:t>32-bit build of the Offline Files cache database dump tool (see BINx64/cscdbdump.exe).</w:t>
+            </w:r>
+          </w:p>
+        </w:tc>
+        <w:tc>
+          <w:tcPr>
+            <w:tcW w:type="dxa" w:w="2160"/>
+          </w:tcPr>
+          <w:p>
+            <w:r>
+              <w:t>psSDP/Diag/global/DC_CscClient-Component.ps1:4: # Date: 2009-2014, 2020-10-26 WalterE added CscDbDump, run script only for Client SKU</w:t>
+            </w:r>
+          </w:p>
+        </w:tc>
+      </w:tr>
+      <w:tr>
+        <w:tc>
+          <w:tcPr>
+            <w:tcW w:type="dxa" w:w="2160"/>
+          </w:tcPr>
+          <w:p>
+            <w:r>
+              <w:t>BINx86/dfsutil.exe</w:t>
+            </w:r>
+          </w:p>
+        </w:tc>
+        <w:tc>
+          <w:tcPr>
+            <w:tcW w:type="dxa" w:w="2160"/>
+          </w:tcPr>
+          <w:p>
+            <w:r>
+              <w:t>Yes / Yes</w:t>
+            </w:r>
+          </w:p>
+        </w:tc>
+        <w:tc>
+          <w:tcPr>
+            <w:tcW w:type="dxa" w:w="2160"/>
+          </w:tcPr>
+          <w:p>
+            <w:r>
+              <w:t>32-bit build of the DFS utility (see BINx64/dfsutil.exe).</w:t>
+            </w:r>
+          </w:p>
+        </w:tc>
+        <w:tc>
+          <w:tcPr>
+            <w:tcW w:type="dxa" w:w="2160"/>
+          </w:tcPr>
+          <w:p>
+            <w:r>
+              <w:t>TSS.ps1:5359: if (Test-Path $DFSutilExe) {</w:t>
+            </w:r>
+          </w:p>
+        </w:tc>
+      </w:tr>
+      <w:tr>
+        <w:tc>
+          <w:tcPr>
+            <w:tcW w:type="dxa" w:w="2160"/>
+          </w:tcPr>
+          <w:p>
+            <w:r>
+              <w:t>BINx86/dpmcmd.exe</w:t>
+            </w:r>
+          </w:p>
+        </w:tc>
+        <w:tc>
+          <w:tcPr>
+            <w:tcW w:type="dxa" w:w="2160"/>
+          </w:tcPr>
+          <w:p>
+            <w:r>
+              <w:t>Yes / Yes</w:t>
+            </w:r>
+          </w:p>
+        </w:tc>
+        <w:tc>
+          <w:tcPr>
+            <w:tcW w:type="dxa" w:w="2160"/>
+          </w:tcPr>
+          <w:p>
+            <w:r>
+              <w:t>32-bit build of the Data Protection Manager command-line tool (see BINx64/dpmcmd.exe).</w:t>
+            </w:r>
+          </w:p>
+        </w:tc>
+        <w:tc>
+          <w:tcPr>
+            <w:tcW w:type="dxa" w:w="2160"/>
+          </w:tcPr>
+          <w:p>
+            <w:r>
+              <w:t xml:space="preserve">TSS_NET.psm1:4523: $DpmCmdPath </w:t>
+              <w:tab/>
+              <w:tab/>
+              <w:tab/>
+              <w:t>= $global:ScriptFolder + $BinArch + "\DpmCmd.exe"</w:t>
+            </w:r>
+          </w:p>
+        </w:tc>
+      </w:tr>
+      <w:tr>
+        <w:tc>
+          <w:tcPr>
+            <w:tcW w:type="dxa" w:w="2160"/>
+          </w:tcPr>
+          <w:p>
+            <w:r>
+              <w:t>BINx86/du.exe</w:t>
+            </w:r>
+          </w:p>
+        </w:tc>
+        <w:tc>
+          <w:tcPr>
+            <w:tcW w:type="dxa" w:w="2160"/>
+          </w:tcPr>
+          <w:p>
+            <w:r>
+              <w:t>Yes / Yes</w:t>
+            </w:r>
+          </w:p>
+        </w:tc>
+        <w:tc>
+          <w:tcPr>
+            <w:tcW w:type="dxa" w:w="2160"/>
+          </w:tcPr>
+          <w:p>
+            <w:r>
+              <w:t>32-bit build corresponding to BINx64/du.exe; same caveat applies — no confirmed direct invocation found (automated matches were false positives).</w:t>
+            </w:r>
+          </w:p>
+        </w:tc>
+        <w:tc>
+          <w:tcPr>
+            <w:tcW w:type="dxa" w:w="2160"/>
+          </w:tcPr>
+          <w:p>
+            <w:r>
+              <w:t>TSSGUI.ps1:28: ::  2024.11.01.0 [rk] _GUI: Code optimization, localization updates and new languages added: Czech, Dutch, Hindi, Portuguese, Turkish.</w:t>
+            </w:r>
+          </w:p>
+        </w:tc>
+      </w:tr>
+      <w:tr>
+        <w:tc>
+          <w:tcPr>
+            <w:tcW w:type="dxa" w:w="2160"/>
+          </w:tcPr>
+          <w:p>
+            <w:r>
+              <w:t>BINx86/evparse.exe</w:t>
+            </w:r>
+          </w:p>
+        </w:tc>
+        <w:tc>
+          <w:tcPr>
+            <w:tcW w:type="dxa" w:w="2160"/>
+          </w:tcPr>
+          <w:p>
+            <w:r>
+              <w:t>Yes / Yes</w:t>
+            </w:r>
+          </w:p>
+        </w:tc>
+        <w:tc>
+          <w:tcPr>
+            <w:tcW w:type="dxa" w:w="2160"/>
+          </w:tcPr>
+          <w:p>
+            <w:r>
+              <w:t>32-bit build of the event log parser utility (see BINx64/evparse.exe).</w:t>
+            </w:r>
+          </w:p>
+        </w:tc>
+        <w:tc>
+          <w:tcPr>
+            <w:tcW w:type="dxa" w:w="2160"/>
+          </w:tcPr>
+          <w:p>
+            <w:r>
+              <w:t>psSDP/Diag/global/TS_AutoAddCommands_VSS.ps1:58: # Parse Storage related event logs on System log using evParse.exe and dump to a HTML file</w:t>
+            </w:r>
+          </w:p>
+        </w:tc>
+      </w:tr>
+      <w:tr>
+        <w:tc>
+          <w:tcPr>
+            <w:tcW w:type="dxa" w:w="2160"/>
+          </w:tcPr>
+          <w:p>
+            <w:r>
+              <w:t>BINx86/fcinfo.exe</w:t>
+            </w:r>
+          </w:p>
+        </w:tc>
+        <w:tc>
+          <w:tcPr>
+            <w:tcW w:type="dxa" w:w="2160"/>
+          </w:tcPr>
+          <w:p>
+            <w:r>
+              <w:t>Yes / Yes</w:t>
+            </w:r>
+          </w:p>
+        </w:tc>
+        <w:tc>
+          <w:tcPr>
+            <w:tcW w:type="dxa" w:w="2160"/>
+          </w:tcPr>
+          <w:p>
+            <w:r>
+              <w:t>32-bit build of the Fibre Channel Information utility (see BINx64/fcinfo.exe).</w:t>
+            </w:r>
+          </w:p>
+        </w:tc>
+        <w:tc>
+          <w:tcPr>
+            <w:tcW w:type="dxa" w:w="2160"/>
+          </w:tcPr>
+          <w:p>
+            <w:r>
+              <w:t>psSDP/Diag/global/TS_AutoAddCommands_VSS.ps1:49: # Collects Fiber Channel information using fcinfo utility</w:t>
+            </w:r>
+          </w:p>
+        </w:tc>
+      </w:tr>
+      <w:tr>
+        <w:tc>
+          <w:tcPr>
+            <w:tcW w:type="dxa" w:w="2160"/>
+          </w:tcPr>
+          <w:p>
+            <w:r>
+              <w:t>BINx86/hbaapi.dll</w:t>
+            </w:r>
+          </w:p>
+        </w:tc>
+        <w:tc>
+          <w:tcPr>
+            <w:tcW w:type="dxa" w:w="2160"/>
+          </w:tcPr>
+          <w:p>
+            <w:r>
+              <w:t>Yes / Yes</w:t>
+            </w:r>
+          </w:p>
+        </w:tc>
+        <w:tc>
+          <w:tcPr>
+            <w:tcW w:type="dxa" w:w="2160"/>
+          </w:tcPr>
+          <w:p>
+            <w:r>
+              <w:t>32-bit build of the Fibre Channel HBA API library (see BINx64/hbaapi.dll).</w:t>
+            </w:r>
+          </w:p>
+        </w:tc>
+        <w:tc>
+          <w:tcPr>
+            <w:tcW w:type="dxa" w:w="2160"/>
+          </w:tcPr>
+          <w:p>
+            <w:r>
+              <w:t>psSDP/Diag/global/DC_FCInfo.ps1:16: #_# Rename-Item -Path "hbaapi_$ProcArc.dll" -NewName "hbaapi.dll"</w:t>
+            </w:r>
+          </w:p>
+        </w:tc>
+      </w:tr>
+      <w:tr>
+        <w:tc>
+          <w:tcPr>
+            <w:tcW w:type="dxa" w:w="2160"/>
+          </w:tcPr>
+          <w:p>
+            <w:r>
+              <w:t>BINx86/hbatapi.dll</w:t>
+            </w:r>
+          </w:p>
+        </w:tc>
+        <w:tc>
+          <w:tcPr>
+            <w:tcW w:type="dxa" w:w="2160"/>
+          </w:tcPr>
+          <w:p>
+            <w:r>
+              <w:t>Yes / Yes</w:t>
+            </w:r>
+          </w:p>
+        </w:tc>
+        <w:tc>
+          <w:tcPr>
+            <w:tcW w:type="dxa" w:w="2160"/>
+          </w:tcPr>
+          <w:p>
+            <w:r>
+              <w:t>32-bit build of the Fibre Channel HBA test/trace API library (see BINx64/hbatapi.dll).</w:t>
+            </w:r>
+          </w:p>
+        </w:tc>
+        <w:tc>
+          <w:tcPr>
+            <w:tcW w:type="dxa" w:w="2160"/>
+          </w:tcPr>
+          <w:p>
+            <w:r>
+              <w:t>psSDP/Diag/global/DC_FCInfo.ps1:17: #_# Rename-Item -Path "hbatapi_$ProcArc.dll" -NewName "hbatapi.dll"</w:t>
+            </w:r>
+          </w:p>
+        </w:tc>
+      </w:tr>
+      <w:tr>
+        <w:tc>
+          <w:tcPr>
+            <w:tcW w:type="dxa" w:w="2160"/>
+          </w:tcPr>
+          <w:p>
+            <w:r>
+              <w:t>BINx86/notmyfaultc.exe</w:t>
+            </w:r>
+          </w:p>
+        </w:tc>
+        <w:tc>
+          <w:tcPr>
+            <w:tcW w:type="dxa" w:w="2160"/>
+          </w:tcPr>
+          <w:p>
+            <w:r>
+              <w:t>Yes / Yes</w:t>
+            </w:r>
+          </w:p>
+        </w:tc>
+        <w:tc>
+          <w:tcPr>
+            <w:tcW w:type="dxa" w:w="2160"/>
+          </w:tcPr>
+          <w:p>
+            <w:r>
+              <w:t>32-bit build of Sysinternals NotMyFault console (see BINx64/notmyfaultc.exe).</w:t>
+            </w:r>
+          </w:p>
+        </w:tc>
+        <w:tc>
+          <w:tcPr>
+            <w:tcW w:type="dxa" w:w="2160"/>
+          </w:tcPr>
+          <w:p>
+            <w:r>
+              <w:t>TSS.ps1:5390: $NotMyFault = Get-Command $global:NotMyFaultcExe -ErrorAction Ignore</w:t>
+            </w:r>
+          </w:p>
+        </w:tc>
+      </w:tr>
+      <w:tr>
+        <w:tc>
+          <w:tcPr>
+            <w:tcW w:type="dxa" w:w="2160"/>
+          </w:tcPr>
+          <w:p>
+            <w:r>
+              <w:t>BINx86/vshadow.exe</w:t>
+            </w:r>
+          </w:p>
+        </w:tc>
+        <w:tc>
+          <w:tcPr>
+            <w:tcW w:type="dxa" w:w="2160"/>
+          </w:tcPr>
+          <w:p>
+            <w:r>
+              <w:t>Yes / Yes</w:t>
+            </w:r>
+          </w:p>
+        </w:tc>
+        <w:tc>
+          <w:tcPr>
+            <w:tcW w:type="dxa" w:w="2160"/>
+          </w:tcPr>
+          <w:p>
+            <w:r>
+              <w:t>32-bit build of the VShadow VSS test tool (see BINx64/vshadow.exe).</w:t>
+            </w:r>
+          </w:p>
+        </w:tc>
+        <w:tc>
+          <w:tcPr>
+            <w:tcW w:type="dxa" w:w="2160"/>
+          </w:tcPr>
+          <w:p>
+            <w:r>
+              <w:t>psSDP/Diag/global/DC_GetSystemInfo.ps1:46: "VShadow/DiskShadow Metadata Writers output" | Out-File $OutputBase -append</w:t>
+            </w:r>
+          </w:p>
+        </w:tc>
+      </w:tr>
+      <w:tr>
+        <w:tc>
+          <w:tcPr>
+            <w:tcW w:type="dxa" w:w="2160"/>
+          </w:tcPr>
+          <w:p>
+            <w:r>
+              <w:t>BINx86/vssagent.exe</w:t>
+            </w:r>
+          </w:p>
+        </w:tc>
+        <w:tc>
+          <w:tcPr>
+            <w:tcW w:type="dxa" w:w="2160"/>
+          </w:tcPr>
+          <w:p>
+            <w:r>
+              <w:t>Yes / Yes</w:t>
+            </w:r>
+          </w:p>
+        </w:tc>
+        <w:tc>
+          <w:tcPr>
+            <w:tcW w:type="dxa" w:w="2160"/>
+          </w:tcPr>
+          <w:p>
+            <w:r>
+              <w:t>32-bit build corresponding to BINx64/vssagent.exe; not independently confirmed.</w:t>
+            </w:r>
+          </w:p>
+        </w:tc>
+        <w:tc>
+          <w:tcPr>
+            <w:tcW w:type="dxa" w:w="2160"/>
+          </w:tcPr>
+          <w:p>
+            <w:r>
+              <w:t>No direct reference found in bundled scripts (695 .ps1/.psm1 files searched)</w:t>
+            </w:r>
+          </w:p>
+        </w:tc>
+      </w:tr>
+      <w:tr>
+        <w:tc>
+          <w:tcPr>
+            <w:tcW w:type="dxa" w:w="2160"/>
+          </w:tcPr>
+          <w:p>
+            <w:r>
+              <w:t>BINx86/vsstrace.exe</w:t>
+            </w:r>
+          </w:p>
+        </w:tc>
+        <w:tc>
+          <w:tcPr>
+            <w:tcW w:type="dxa" w:w="2160"/>
+          </w:tcPr>
+          <w:p>
+            <w:r>
+              <w:t>Yes / Yes</w:t>
+            </w:r>
+          </w:p>
+        </w:tc>
+        <w:tc>
+          <w:tcPr>
+            <w:tcW w:type="dxa" w:w="2160"/>
+          </w:tcPr>
+          <w:p>
+            <w:r>
+              <w:t>32-bit build of the VSS tracing tool (see BINx64/vsstrace.exe).</w:t>
+            </w:r>
+          </w:p>
+        </w:tc>
+        <w:tc>
+          <w:tcPr>
+            <w:tcW w:type="dxa" w:w="2160"/>
+          </w:tcPr>
+          <w:p>
+            <w:r>
+              <w:t>TSS_SHA.psm1:540: '{9122168F-2432-45F0-B91C-3AF363C149DD}' # VSSTraceLogProvider</w:t>
+            </w:r>
+          </w:p>
+        </w:tc>
+      </w:tr>
+      <w:tr>
+        <w:tc>
+          <w:tcPr>
+            <w:tcW w:type="dxa" w:w="2160"/>
+          </w:tcPr>
+          <w:p>
+            <w:r>
+              <w:t>config/GUI/tssGUI-icons.dll</w:t>
+            </w:r>
+          </w:p>
+        </w:tc>
+        <w:tc>
+          <w:tcPr>
+            <w:tcW w:type="dxa" w:w="2160"/>
+          </w:tcPr>
+          <w:p>
+            <w:r>
+              <w:t>No (unsigned)</w:t>
+            </w:r>
+          </w:p>
+        </w:tc>
+        <w:tc>
+          <w:tcPr>
+            <w:tcW w:type="dxa" w:w="2160"/>
+          </w:tcPr>
+          <w:p>
+            <w:r>
+              <w:t>Resource-only icon library for the TSSGUI front-end; loaded exclusively via Shell32!ExtractIconEx (no code execution) — see the detailed weak-link analysis in section 3.3.2 of the report.</w:t>
+            </w:r>
+          </w:p>
+        </w:tc>
+        <w:tc>
+          <w:tcPr>
+            <w:tcW w:type="dxa" w:w="2160"/>
+          </w:tcPr>
+          <w:p>
+            <w:r>
+              <w:t>TSSGUI.ps1:17: ::  2025.12.31.0 [rk] _GUI: #162335: Added maximize-friendly dynamic resizing, added “Ask M365/Copilot” button (prefer M365, fallback to Windows, hide if unavai</w:t>
+            </w:r>
+          </w:p>
+        </w:tc>
+      </w:tr>
+      <w:tr>
+        <w:tc>
+          <w:tcPr>
+            <w:tcW w:type="dxa" w:w="2160"/>
+          </w:tcPr>
+          <w:p>
+            <w:r>
+              <w:t>psSDP/Diag/global/DiagPackage.dll</w:t>
+            </w:r>
+          </w:p>
+        </w:tc>
+        <w:tc>
+          <w:tcPr>
+            <w:tcW w:type="dxa" w:w="2160"/>
+          </w:tcPr>
+          <w:p>
+            <w:r>
+              <w:t>Yes / Yes</w:t>
+            </w:r>
+          </w:p>
+        </w:tc>
+        <w:tc>
+          <w:tcPr>
+            <w:tcW w:type="dxa" w:w="2160"/>
+          </w:tcPr>
+          <w:p>
+            <w:r>
+              <w:t>Windows Diagnostic Package framework component; the psSDP diagnostic scripts test for a companion .diagpkg manifest file consistent with this framework.</w:t>
+            </w:r>
+          </w:p>
+        </w:tc>
+        <w:tc>
+          <w:tcPr>
+            <w:tcW w:type="dxa" w:w="2160"/>
+          </w:tcPr>
+          <w:p>
+            <w:r>
+              <w:t>scripts/utils_CTS.ps1:765: if (Test-Path ($PWD.Path + "\DiagPackage.diagpkg")){</w:t>
+            </w:r>
+          </w:p>
+        </w:tc>
+      </w:tr>
+      <w:tr>
+        <w:tc>
+          <w:tcPr>
+            <w:tcW w:type="dxa" w:w="2160"/>
+          </w:tcPr>
+          <w:p>
+            <w:r>
+              <w:t>psSDP/Diag/global/DumpEVT.exe</w:t>
+            </w:r>
+          </w:p>
+        </w:tc>
+        <w:tc>
+          <w:tcPr>
+            <w:tcW w:type="dxa" w:w="2160"/>
+          </w:tcPr>
+          <w:p>
+            <w:r>
+              <w:t>Yes / Yes</w:t>
+            </w:r>
+          </w:p>
+        </w:tc>
+        <w:tc>
+          <w:tcPr>
+            <w:tcW w:type="dxa" w:w="2160"/>
+          </w:tcPr>
+          <w:p>
+            <w:r>
+              <w:t>Event log dump utility ('DumpEVT') — invoked to export Windows Event Log contents to files as part of psSDP diagnostic data collection (e.g. DPM event logs).</w:t>
+            </w:r>
+          </w:p>
+        </w:tc>
+        <w:tc>
+          <w:tcPr>
+            <w:tcW w:type="dxa" w:w="2160"/>
+          </w:tcPr>
+          <w:p>
+            <w:r>
+              <w:t>psSDP/Diag/global/DC_DPMEventLogs.ps1:22: $command = ".\dumpevt.exe Result\" + $computername + "_evt_ " + $eventlog</w:t>
+            </w:r>
+          </w:p>
+        </w:tc>
+      </w:tr>
+      <w:tr>
+        <w:tc>
+          <w:tcPr>
+            <w:tcW w:type="dxa" w:w="2160"/>
+          </w:tcPr>
+          <w:p>
+            <w:r>
+              <w:t>psSDP/Diag/global/MGADiag.exe</w:t>
+            </w:r>
+          </w:p>
+        </w:tc>
+        <w:tc>
+          <w:tcPr>
+            <w:tcW w:type="dxa" w:w="2160"/>
+          </w:tcPr>
+          <w:p>
+            <w:r>
+              <w:t>Yes / Yes</w:t>
+            </w:r>
+          </w:p>
+        </w:tc>
+        <w:tc>
+          <w:tcPr>
+            <w:tcW w:type="dxa" w:w="2160"/>
+          </w:tcPr>
+          <w:p>
+            <w:r>
+              <w:t>Windows/Office Genuine Advantage diagnostic tool — invoked to produce a WGADiag.txt licensing-validation diagnostic report.</w:t>
+            </w:r>
+          </w:p>
+        </w:tc>
+        <w:tc>
+          <w:tcPr>
+            <w:tcW w:type="dxa" w:w="2160"/>
+          </w:tcPr>
+          <w:p>
+            <w:r>
+              <w:t>psSDP/Diag/global/DC_WGADiag.ps1:6: # Description: Runs MGADiag.exe and outputs to WGADiag.txt</w:t>
+            </w:r>
+          </w:p>
+        </w:tc>
+      </w:tr>
+      <w:tr>
+        <w:tc>
+          <w:tcPr>
+            <w:tcW w:type="dxa" w:w="2160"/>
+          </w:tcPr>
+          <w:p>
+            <w:r>
+              <w:t>psSDP/Diag/global/SAN.exe</w:t>
+            </w:r>
+          </w:p>
+        </w:tc>
+        <w:tc>
+          <w:tcPr>
+            <w:tcW w:type="dxa" w:w="2160"/>
+          </w:tcPr>
+          <w:p>
+            <w:r>
+              <w:t>Yes / Yes</w:t>
+            </w:r>
+          </w:p>
+        </w:tc>
+        <w:tc>
+          <w:tcPr>
+            <w:tcW w:type="dxa" w:w="2160"/>
+          </w:tcPr>
+          <w:p>
+            <w:r>
+              <w:t>No confirmed direct script reference (the automated match was a false positive on an unrelated GUI/Copilot function name); purpose not independently confirmed from the reviewed scripts, though the name suggests a Storage Area Network diagnostic tool consistent with the surrounding psSDP/Diag/global storage tools.</w:t>
+            </w:r>
+          </w:p>
+        </w:tc>
+        <w:tc>
+          <w:tcPr>
+            <w:tcW w:type="dxa" w:w="2160"/>
+          </w:tcPr>
+          <w:p>
+            <w:r>
+              <w:t>TSSGUI.ps1:3382: function Test-HasAnyCopilotApp {</w:t>
+            </w:r>
+          </w:p>
+        </w:tc>
+      </w:tr>
+      <w:tr>
+        <w:tc>
+          <w:tcPr>
+            <w:tcW w:type="dxa" w:w="2160"/>
+          </w:tcPr>
+          <w:p>
+            <w:r>
+              <w:t>psSDP/Diag/global/Showpriv.exe</w:t>
+            </w:r>
+          </w:p>
+        </w:tc>
+        <w:tc>
+          <w:tcPr>
+            <w:tcW w:type="dxa" w:w="2160"/>
+          </w:tcPr>
+          <w:p>
+            <w:r>
+              <w:t>Yes / Yes</w:t>
+            </w:r>
+          </w:p>
+        </w:tc>
+        <w:tc>
+          <w:tcPr>
+            <w:tcW w:type="dxa" w:w="2160"/>
+          </w:tcPr>
+          <w:p>
+            <w:r>
+              <w:t>Duplicate copy of the privilege-enumeration tool bundled specifically for the psSDP diagnostic framework (see BIN/Showpriv.exe); invoked identically via the user-rights diagnostic script.</w:t>
+            </w:r>
+          </w:p>
+        </w:tc>
+        <w:tc>
+          <w:tcPr>
+            <w:tcW w:type="dxa" w:w="2160"/>
+          </w:tcPr>
+          <w:p>
+            <w:r>
+              <w:t>psSDP/Diag/global/DC_UserRights.ps1:19: 'Skipping running {showpriv.exe} since it is not supported in ' + $OSArchitecture + ' architecture.' | WriteTo-StdOut</w:t>
+            </w:r>
+          </w:p>
+        </w:tc>
+      </w:tr>
+      <w:tr>
+        <w:tc>
+          <w:tcPr>
+            <w:tcW w:type="dxa" w:w="2160"/>
+          </w:tcPr>
+          <w:p>
+            <w:r>
+              <w:t>psSDP/Diag/global/WSRUNAMD64.EXE</w:t>
+            </w:r>
+          </w:p>
+        </w:tc>
+        <w:tc>
+          <w:tcPr>
+            <w:tcW w:type="dxa" w:w="2160"/>
+          </w:tcPr>
+          <w:p>
+            <w:r>
+              <w:t>Yes / Yes</w:t>
+            </w:r>
+          </w:p>
+        </w:tc>
+        <w:tc>
+          <w:tcPr>
+            <w:tcW w:type="dxa" w:w="2160"/>
+          </w:tcPr>
+          <w:p>
+            <w:r>
+              <w:t>No direct script reference found; by naming convention, an architecture-specific (AMD64) launcher/runtime component for the psSDP diagnostic framework, not independently confirmed.</w:t>
+            </w:r>
+          </w:p>
+        </w:tc>
+        <w:tc>
+          <w:tcPr>
+            <w:tcW w:type="dxa" w:w="2160"/>
+          </w:tcPr>
+          <w:p>
+            <w:r>
+              <w:t>No direct reference found in bundled scripts (695 .ps1/.psm1 files searched)</w:t>
+            </w:r>
+          </w:p>
+        </w:tc>
+      </w:tr>
+      <w:tr>
+        <w:tc>
+          <w:tcPr>
+            <w:tcW w:type="dxa" w:w="2160"/>
+          </w:tcPr>
+          <w:p>
+            <w:r>
+              <w:t>psSDP/Diag/global/WSRUNI386.EXE</w:t>
+            </w:r>
+          </w:p>
+        </w:tc>
+        <w:tc>
+          <w:tcPr>
+            <w:tcW w:type="dxa" w:w="2160"/>
+          </w:tcPr>
+          <w:p>
+            <w:r>
+              <w:t>Yes / Yes</w:t>
+            </w:r>
+          </w:p>
+        </w:tc>
+        <w:tc>
+          <w:tcPr>
+            <w:tcW w:type="dxa" w:w="2160"/>
+          </w:tcPr>
+          <w:p>
+            <w:r>
+              <w:t>No direct script reference found; 32-bit (i386) counterpart to WSRUNAMD64.EXE, not independently confirmed.</w:t>
+            </w:r>
+          </w:p>
+        </w:tc>
+        <w:tc>
+          <w:tcPr>
+            <w:tcW w:type="dxa" w:w="2160"/>
+          </w:tcPr>
+          <w:p>
+            <w:r>
+              <w:t>No direct reference found in bundled scripts (695 .ps1/.psm1 files searched)</w:t>
+            </w:r>
+          </w:p>
+        </w:tc>
+      </w:tr>
+      <w:tr>
+        <w:tc>
+          <w:tcPr>
+            <w:tcW w:type="dxa" w:w="2160"/>
+          </w:tcPr>
+          <w:p>
+            <w:r>
+              <w:t>psSDP/Diag/global/autorunsc.exe</w:t>
+            </w:r>
+          </w:p>
+        </w:tc>
+        <w:tc>
+          <w:tcPr>
+            <w:tcW w:type="dxa" w:w="2160"/>
+          </w:tcPr>
+          <w:p>
+            <w:r>
+              <w:t>Yes / Yes</w:t>
+            </w:r>
+          </w:p>
+        </w:tc>
+        <w:tc>
+          <w:tcPr>
+            <w:tcW w:type="dxa" w:w="2160"/>
+          </w:tcPr>
+          <w:p>
+            <w:r>
+              <w:t>Duplicate copy of Sysinternals Autoruns bundled for the psSDP diagnostic framework (see BIN/autorunsc.exe); invoked by the same registry-autoruns check script.</w:t>
+            </w:r>
+          </w:p>
+        </w:tc>
+        <w:tc>
+          <w:tcPr>
+            <w:tcW w:type="dxa" w:w="2160"/>
+          </w:tcPr>
+          <w:p>
+            <w:r>
+              <w:t>psSDP/Diag/global/TS_RegistryEntryForAutorunsCheck.ps1:2: # TS_RegistryEntryForAutorunsCheck.ps1</w:t>
+            </w:r>
+          </w:p>
+        </w:tc>
+      </w:tr>
+      <w:tr>
+        <w:tc>
+          <w:tcPr>
+            <w:tcW w:type="dxa" w:w="2160"/>
+          </w:tcPr>
+          <w:p>
+            <w:r>
+              <w:t>psSDP/Diag/global/cdb.exe</w:t>
+            </w:r>
+          </w:p>
+        </w:tc>
+        <w:tc>
+          <w:tcPr>
+            <w:tcW w:type="dxa" w:w="2160"/>
+          </w:tcPr>
+          <w:p>
+            <w:r>
+              <w:t>Yes / Yes</w:t>
+            </w:r>
+          </w:p>
+        </w:tc>
+        <w:tc>
+          <w:tcPr>
+            <w:tcW w:type="dxa" w:w="2160"/>
+          </w:tcPr>
+          <w:p>
+            <w:r>
+              <w:t>Microsoft Console Debugger (cdb.exe, from Debugging Tools for Windows) — referenced in obfuscated/encoded blocks of TSSGUI.ps1 and xray.ps1 that could not be reliably attributed to a specific invocation in this review; bundled as a standard user-mode debugger for the diagnostic framework.</w:t>
+            </w:r>
+          </w:p>
+        </w:tc>
+        <w:tc>
+          <w:tcPr>
+            <w:tcW w:type="dxa" w:w="2160"/>
+          </w:tcPr>
+          <w:p>
+            <w:r>
+              <w:t>TSSGUI.ps1:4178: # 97Evbnzg8bd3hxrfz6CcCVuf77egvRHinthJuwSRePP7aVmcevb1nWUIAICdBebH</w:t>
+            </w:r>
+          </w:p>
+        </w:tc>
+      </w:tr>
+      <w:tr>
+        <w:tc>
+          <w:tcPr>
+            <w:tcW w:type="dxa" w:w="2160"/>
+          </w:tcPr>
+          <w:p>
+            <w:r>
+              <w:t>psSDP/Diag/global/certadm.dll</w:t>
+            </w:r>
+          </w:p>
+        </w:tc>
+        <w:tc>
+          <w:tcPr>
+            <w:tcW w:type="dxa" w:w="2160"/>
+          </w:tcPr>
+          <w:p>
+            <w:r>
+              <w:t>Yes / Yes</w:t>
+            </w:r>
+          </w:p>
+        </w:tc>
+        <w:tc>
+          <w:tcPr>
+            <w:tcW w:type="dxa" w:w="2160"/>
+          </w:tcPr>
+          <w:p>
+            <w:r>
+              <w:t>Certificate Services administration library — no direct script reference found, plausibly used by ADCS (certificate authority) -related diagnostic scripts elsewhere in the toolkit, not independently confirmed.</w:t>
+            </w:r>
+          </w:p>
+        </w:tc>
+        <w:tc>
+          <w:tcPr>
+            <w:tcW w:type="dxa" w:w="2160"/>
+          </w:tcPr>
+          <w:p>
+            <w:r>
+              <w:t>No direct reference found in bundled scripts (695 .ps1/.psm1 files searched)</w:t>
+            </w:r>
+          </w:p>
+        </w:tc>
+      </w:tr>
+      <w:tr>
+        <w:tc>
+          <w:tcPr>
+            <w:tcW w:type="dxa" w:w="2160"/>
+          </w:tcPr>
+          <w:p>
+            <w:r>
+              <w:t>psSDP/Diag/global/clusmps.exe</w:t>
+            </w:r>
+          </w:p>
+        </w:tc>
+        <w:tc>
+          <w:tcPr>
+            <w:tcW w:type="dxa" w:w="2160"/>
+          </w:tcPr>
+          <w:p>
+            <w:r>
+              <w:t>Yes / Yes</w:t>
+            </w:r>
+          </w:p>
+        </w:tc>
+        <w:tc>
+          <w:tcPr>
+            <w:tcW w:type="dxa" w:w="2160"/>
+          </w:tcPr>
+          <w:p>
+            <w:r>
+              <w:t>Cluster diagnostic tool — invoked with /S /G /P: flags to collect Windows Failover Cluster minimal poll-set information.</w:t>
+            </w:r>
+          </w:p>
+        </w:tc>
+        <w:tc>
+          <w:tcPr>
+            <w:tcW w:type="dxa" w:w="2160"/>
+          </w:tcPr>
+          <w:p>
+            <w:r>
+              <w:t>psSDP/Diag/global/TS_BasicClusterInfo.ps1:276: $CommandToRun = "`"" + $pwd.Path  + "\clusmps.exe`" /S /G /P:`"" + $pwd.Path + "`""</w:t>
+            </w:r>
+          </w:p>
+        </w:tc>
+      </w:tr>
+      <w:tr>
+        <w:tc>
+          <w:tcPr>
+            <w:tcW w:type="dxa" w:w="2160"/>
+          </w:tcPr>
+          <w:p>
+            <w:r>
+              <w:t>psSDP/Diag/global/dbgeng.dll</w:t>
+            </w:r>
+          </w:p>
+        </w:tc>
+        <w:tc>
+          <w:tcPr>
+            <w:tcW w:type="dxa" w:w="2160"/>
+          </w:tcPr>
+          <w:p>
+            <w:r>
+              <w:t>Yes / Yes</w:t>
+            </w:r>
+          </w:p>
+        </w:tc>
+        <w:tc>
+          <w:tcPr>
+            <w:tcW w:type="dxa" w:w="2160"/>
+          </w:tcPr>
+          <w:p>
+            <w:r>
+              <w:t>Debug engine library (from Debugging Tools for Windows) — a runtime dependency of cdb.exe; no direct script reference found beyond its bundling alongside the debugger.</w:t>
+            </w:r>
+          </w:p>
+        </w:tc>
+        <w:tc>
+          <w:tcPr>
+            <w:tcW w:type="dxa" w:w="2160"/>
+          </w:tcPr>
+          <w:p>
+            <w:r>
+              <w:t>No direct reference found in bundled scripts (695 .ps1/.psm1 files searched)</w:t>
+            </w:r>
+          </w:p>
+        </w:tc>
+      </w:tr>
+      <w:tr>
+        <w:tc>
+          <w:tcPr>
+            <w:tcW w:type="dxa" w:w="2160"/>
+          </w:tcPr>
+          <w:p>
+            <w:r>
+              <w:t>psSDP/Diag/global/dbghelp.dll</w:t>
+            </w:r>
+          </w:p>
+        </w:tc>
+        <w:tc>
+          <w:tcPr>
+            <w:tcW w:type="dxa" w:w="2160"/>
+          </w:tcPr>
+          <w:p>
+            <w:r>
+              <w:t>Yes / Yes</w:t>
+            </w:r>
+          </w:p>
+        </w:tc>
+        <w:tc>
+          <w:tcPr>
+            <w:tcW w:type="dxa" w:w="2160"/>
+          </w:tcPr>
+          <w:p>
+            <w:r>
+              <w:t>Debug help library — used directly via P/Invoke (MiniDumpWriteDump) from TSS.ps1 and a dedicated AD performance data collection script to produce process memory dumps.</w:t>
+            </w:r>
+          </w:p>
+        </w:tc>
+        <w:tc>
+          <w:tcPr>
+            <w:tcW w:type="dxa" w:w="2160"/>
+          </w:tcPr>
+          <w:p>
+            <w:r>
+              <w:t>TSS.ps1:7675: [DllImport("dbghelp.dll", EntryPoint = "MiniDumpWriteDump", CallingConvention = CallingConvention.Winapi, CharSet = CharSet.Unicode, ExactSpelling = true, SetLa</w:t>
+            </w:r>
+          </w:p>
+        </w:tc>
+      </w:tr>
+      <w:tr>
+        <w:tc>
+          <w:tcPr>
+            <w:tcW w:type="dxa" w:w="2160"/>
+          </w:tcPr>
+          <w:p>
+            <w:r>
+              <w:t>psSDP/Diag/global/devcon.exe</w:t>
+            </w:r>
+          </w:p>
+        </w:tc>
+        <w:tc>
+          <w:tcPr>
+            <w:tcW w:type="dxa" w:w="2160"/>
+          </w:tcPr>
+          <w:p>
+            <w:r>
+              <w:t>Yes / Yes</w:t>
+            </w:r>
+          </w:p>
+        </w:tc>
+        <w:tc>
+          <w:tcPr>
+            <w:tcW w:type="dxa" w:w="2160"/>
+          </w:tcPr>
+          <w:p>
+            <w:r>
+              <w:t>Duplicate copy of the Device Console tool bundled for the psSDP diagnostic framework (see BIN/devcon.exe); invoked by the same device/connection diagnostic script.</w:t>
+            </w:r>
+          </w:p>
+        </w:tc>
+        <w:tc>
+          <w:tcPr>
+            <w:tcW w:type="dxa" w:w="2160"/>
+          </w:tcPr>
+          <w:p>
+            <w:r>
+              <w:t>psSDP/Diag/global/TS_AutoAddCommands_SETUP.ps1:56: # Obtain information about Devices and connections using devcon.exe utility</w:t>
+            </w:r>
+          </w:p>
+        </w:tc>
+      </w:tr>
+      <w:tr>
+        <w:tc>
+          <w:tcPr>
+            <w:tcW w:type="dxa" w:w="2160"/>
+          </w:tcPr>
+          <w:p>
+            <w:r>
+              <w:t>psSDP/Diag/global/dosdev.exe</w:t>
+            </w:r>
+          </w:p>
+        </w:tc>
+        <w:tc>
+          <w:tcPr>
+            <w:tcW w:type="dxa" w:w="2160"/>
+          </w:tcPr>
+          <w:p>
+            <w:r>
+              <w:t>Yes / Yes</w:t>
+            </w:r>
+          </w:p>
+        </w:tc>
+        <w:tc>
+          <w:tcPr>
+            <w:tcW w:type="dxa" w:w="2160"/>
+          </w:tcPr>
+          <w:p>
+            <w:r>
+              <w:t>WDK tool that creates/enumerates MS-DOS device name symbolic links; invoked by a dedicated DC_DOSDev.ps1 diagnostic script.</w:t>
+            </w:r>
+          </w:p>
+        </w:tc>
+        <w:tc>
+          <w:tcPr>
+            <w:tcW w:type="dxa" w:w="2160"/>
+          </w:tcPr>
+          <w:p>
+            <w:r>
+              <w:t>psSDP/Diag/global/TS_AutoAddCommands_VSS.ps1:52: # Obtain information about MS-DOS device names (symbolic links) via DOSDev utility</w:t>
+            </w:r>
+          </w:p>
+        </w:tc>
+      </w:tr>
+      <w:tr>
+        <w:tc>
+          <w:tcPr>
+            <w:tcW w:type="dxa" w:w="2160"/>
+          </w:tcPr>
+          <w:p>
+            <w:r>
+              <w:t>psSDP/Diag/global/fltrfind.exe</w:t>
+            </w:r>
+          </w:p>
+        </w:tc>
+        <w:tc>
+          <w:tcPr>
+            <w:tcW w:type="dxa" w:w="2160"/>
+          </w:tcPr>
+          <w:p>
+            <w:r>
+              <w:t>Yes / Yes</w:t>
+            </w:r>
+          </w:p>
+        </w:tc>
+        <w:tc>
+          <w:tcPr>
+            <w:tcW w:type="dxa" w:w="2160"/>
+          </w:tcPr>
+          <w:p>
+            <w:r>
+              <w:t>WDK filter-manager utility — lists upper/lower filter drivers attached to volumes; invoked by a dedicated DC_Fltrfind.ps1 diagnostic script.</w:t>
+            </w:r>
+          </w:p>
+        </w:tc>
+        <w:tc>
+          <w:tcPr>
+            <w:tcW w:type="dxa" w:w="2160"/>
+          </w:tcPr>
+          <w:p>
+            <w:r>
+              <w:t>psSDP/Diag/global/TS_AutoAddCommands_SUVP.ps1:102: # Obtain information about Upper and lower filters Information fltrfind.exe utility</w:t>
+            </w:r>
+          </w:p>
+        </w:tc>
+      </w:tr>
+      <w:tr>
+        <w:tc>
+          <w:tcPr>
+            <w:tcW w:type="dxa" w:w="2160"/>
+          </w:tcPr>
+          <w:p>
+            <w:r>
+              <w:t>psSDP/Diag/global/memsnap.exe</w:t>
+            </w:r>
+          </w:p>
+        </w:tc>
+        <w:tc>
+          <w:tcPr>
+            <w:tcW w:type="dxa" w:w="2160"/>
+          </w:tcPr>
+          <w:p>
+            <w:r>
+              <w:t>Yes / Yes</w:t>
+            </w:r>
+          </w:p>
+        </w:tc>
+        <w:tc>
+          <w:tcPr>
+            <w:tcW w:type="dxa" w:w="2160"/>
+          </w:tcPr>
+          <w:p>
+            <w:r>
+              <w:t>Kernel pool memory usage snapshot tool; output redirected to a memsnap.txt file as part of process-info diagnostic collection.</w:t>
+            </w:r>
+          </w:p>
+        </w:tc>
+        <w:tc>
+          <w:tcPr>
+            <w:tcW w:type="dxa" w:w="2160"/>
+          </w:tcPr>
+          <w:p>
+            <w:r>
+              <w:t>psSDP/Diag/global/TS_ProcessInfo.ps1:7: #              Also, it shows statistics for Kernel Pool memory usage using MemSnap tool</w:t>
+            </w:r>
+          </w:p>
+        </w:tc>
+      </w:tr>
+      <w:tr>
+        <w:tc>
+          <w:tcPr>
+            <w:tcW w:type="dxa" w:w="2160"/>
+          </w:tcPr>
+          <w:p>
+            <w:r>
+              <w:t>psSDP/Diag/global/vshadow-x64.exe</w:t>
+            </w:r>
+          </w:p>
+        </w:tc>
+        <w:tc>
+          <w:tcPr>
+            <w:tcW w:type="dxa" w:w="2160"/>
+          </w:tcPr>
+          <w:p>
+            <w:r>
+              <w:t>Yes / Yes</w:t>
+            </w:r>
+          </w:p>
+        </w:tc>
+        <w:tc>
+          <w:tcPr>
+            <w:tcW w:type="dxa" w:w="2160"/>
+          </w:tcPr>
+          <w:p>
+            <w:r>
+              <w:t>x64 build of the VShadow VSS test tool bundled for the psSDP diagnostic framework (see BINx64/vshadow.exe); no direct script reference found beyond its bundling.</w:t>
+            </w:r>
+          </w:p>
+        </w:tc>
+        <w:tc>
+          <w:tcPr>
+            <w:tcW w:type="dxa" w:w="2160"/>
+          </w:tcPr>
+          <w:p>
+            <w:r>
+              <w:t>No direct reference found in bundled scripts (695 .ps1/.psm1 files searched)</w:t>
+            </w:r>
+          </w:p>
+        </w:tc>
+      </w:tr>
+      <w:tr>
+        <w:tc>
+          <w:tcPr>
+            <w:tcW w:type="dxa" w:w="2160"/>
+          </w:tcPr>
+          <w:p>
+            <w:r>
+              <w:t>psSDP/Diag/global/vshadow.exe</w:t>
+            </w:r>
+          </w:p>
+        </w:tc>
+        <w:tc>
+          <w:tcPr>
+            <w:tcW w:type="dxa" w:w="2160"/>
+          </w:tcPr>
+          <w:p>
+            <w:r>
+              <w:t>Yes / Yes</w:t>
+            </w:r>
+          </w:p>
+        </w:tc>
+        <w:tc>
+          <w:tcPr>
+            <w:tcW w:type="dxa" w:w="2160"/>
+          </w:tcPr>
+          <w:p>
+            <w:r>
+              <w:t>Duplicate copy of the VShadow VSS test tool bundled for the psSDP diagnostic framework (see BIN.../vshadow.exe); invoked identically via the system-info diagnostic script.</w:t>
+            </w:r>
+          </w:p>
+        </w:tc>
+        <w:tc>
+          <w:tcPr>
+            <w:tcW w:type="dxa" w:w="2160"/>
+          </w:tcPr>
+          <w:p>
+            <w:r>
+              <w:t>psSDP/Diag/global/DC_GetSystemInfo.ps1:46: "VShadow/DiskShadow Metadata Writers output" | Out-File $OutputBase -append</w:t>
+            </w:r>
+          </w:p>
+        </w:tc>
+      </w:tr>
+      <w:tr>
+        <w:tc>
+          <w:tcPr>
+            <w:tcW w:type="dxa" w:w="2160"/>
+          </w:tcPr>
+          <w:p>
+            <w:r>
+              <w:t>scripts/CRUtil/CRUtil.exe</w:t>
+            </w:r>
+          </w:p>
+        </w:tc>
+        <w:tc>
+          <w:tcPr>
+            <w:tcW w:type="dxa" w:w="2160"/>
+          </w:tcPr>
+          <w:p>
+            <w:r>
+              <w:t>Yes / Yes</w:t>
+            </w:r>
+          </w:p>
+        </w:tc>
+        <w:tc>
+          <w:tcPr>
+            <w:tcW w:type="dxa" w:w="2160"/>
+          </w:tcPr>
+          <w:p>
+            <w:r>
+              <w:t>Credential Roaming diagnostic/repair utility ('CRUtil') — moved into TSS from a standalone tool per its module changelog; used by the accompanying CRU.ps1 wrapper script for AD credential-roaming diagnostics.</w:t>
+            </w:r>
+          </w:p>
+        </w:tc>
+        <w:tc>
+          <w:tcPr>
+            <w:tcW w:type="dxa" w:w="2160"/>
+          </w:tcPr>
+          <w:p>
+            <w:r>
+              <w:t>TSS_ADS.psm1:55: ::  2024.05.03.0 [mm] _ADS: moved CRUtil and GetRemoteToken scripts and binaries into TSS</w:t>
+            </w:r>
+          </w:p>
+        </w:tc>
+      </w:tr>
+      <w:tr>
+        <w:tc>
+          <w:tcPr>
+            <w:tcW w:type="dxa" w:w="2160"/>
+          </w:tcPr>
+          <w:p>
+            <w:r>
+              <w:t>scripts/CRUtil/CredRoamADUserCmdLet.dll</w:t>
+            </w:r>
+          </w:p>
+        </w:tc>
+        <w:tc>
+          <w:tcPr>
+            <w:tcW w:type="dxa" w:w="2160"/>
+          </w:tcPr>
+          <w:p>
+            <w:r>
+              <w:t>Yes / Yes</w:t>
+            </w:r>
+          </w:p>
+        </w:tc>
+        <w:tc>
+          <w:tcPr>
+            <w:tcW w:type="dxa" w:w="2160"/>
+          </w:tcPr>
+          <w:p>
+            <w:r>
+              <w:t>PowerShell cmdlet library for AD-based credential roaming data collection, loaded conditionally by CRU.ps1 based on OS architecture.</w:t>
+            </w:r>
+          </w:p>
+        </w:tc>
+        <w:tc>
+          <w:tcPr>
+            <w:tcW w:type="dxa" w:w="2160"/>
+          </w:tcPr>
+          <w:p>
+            <w:r>
+              <w:t>scripts/CRUtil/CRU.ps1:690: $CMDletDLL = "CredRoamADUserCMDlet.dll"</w:t>
+            </w:r>
+          </w:p>
+        </w:tc>
+      </w:tr>
+      <w:tr>
+        <w:tc>
+          <w:tcPr>
+            <w:tcW w:type="dxa" w:w="2160"/>
+          </w:tcPr>
+          <w:p>
+            <w:r>
+              <w:t>scripts/CRUtil/CredRoamADUserCmdLetAMD64.dll</w:t>
+            </w:r>
+          </w:p>
+        </w:tc>
+        <w:tc>
+          <w:tcPr>
+            <w:tcW w:type="dxa" w:w="2160"/>
+          </w:tcPr>
+          <w:p>
+            <w:r>
+              <w:t>Yes / Yes</w:t>
+            </w:r>
+          </w:p>
+        </w:tc>
+        <w:tc>
+          <w:tcPr>
+            <w:tcW w:type="dxa" w:w="2160"/>
+          </w:tcPr>
+          <w:p>
+            <w:r>
+              <w:t>AMD64 build of the AD credential-roaming cmdlet library, loaded conditionally by CRU.ps1 on 64-bit systems.</w:t>
+            </w:r>
+          </w:p>
+        </w:tc>
+        <w:tc>
+          <w:tcPr>
+            <w:tcW w:type="dxa" w:w="2160"/>
+          </w:tcPr>
+          <w:p>
+            <w:r>
+              <w:t>scripts/CRUtil/CRU.ps1:694: $CMDletDLL = "CredRoamADUserCMDletAMD64.dll"</w:t>
+            </w:r>
+          </w:p>
+        </w:tc>
+      </w:tr>
+      <w:tr>
+        <w:tc>
+          <w:tcPr>
+            <w:tcW w:type="dxa" w:w="2160"/>
+          </w:tcPr>
+          <w:p>
+            <w:r>
+              <w:t>scripts/CRUtil/CredRoamLVRCmdLet.dll</w:t>
+            </w:r>
+          </w:p>
+        </w:tc>
+        <w:tc>
+          <w:tcPr>
+            <w:tcW w:type="dxa" w:w="2160"/>
+          </w:tcPr>
+          <w:p>
+            <w:r>
+              <w:t>Yes / Yes</w:t>
+            </w:r>
+          </w:p>
+        </w:tc>
+        <w:tc>
+          <w:tcPr>
+            <w:tcW w:type="dxa" w:w="2160"/>
+          </w:tcPr>
+          <w:p>
+            <w:r>
+              <w:t>PowerShell cmdlet library for Live ID/LVR-based credential roaming data collection, loaded conditionally by CRU.ps1.</w:t>
+            </w:r>
+          </w:p>
+        </w:tc>
+        <w:tc>
+          <w:tcPr>
+            <w:tcW w:type="dxa" w:w="2160"/>
+          </w:tcPr>
+          <w:p>
+            <w:r>
+              <w:t>scripts/CRUtil/CRU.ps1:678: $CMDletDLL = "CredRoamLVRCMDlet.dll"</w:t>
+            </w:r>
+          </w:p>
+        </w:tc>
+      </w:tr>
+      <w:tr>
+        <w:tc>
+          <w:tcPr>
+            <w:tcW w:type="dxa" w:w="2160"/>
+          </w:tcPr>
+          <w:p>
+            <w:r>
+              <w:t>scripts/CRUtil/CredRoamLVRCmdLetAMD64.dll</w:t>
+            </w:r>
+          </w:p>
+        </w:tc>
+        <w:tc>
+          <w:tcPr>
+            <w:tcW w:type="dxa" w:w="2160"/>
+          </w:tcPr>
+          <w:p>
+            <w:r>
+              <w:t>Yes / Yes</w:t>
+            </w:r>
+          </w:p>
+        </w:tc>
+        <w:tc>
+          <w:tcPr>
+            <w:tcW w:type="dxa" w:w="2160"/>
+          </w:tcPr>
+          <w:p>
+            <w:r>
+              <w:t>AMD64 build of the LVR credential-roaming cmdlet library, loaded conditionally by CRU.ps1 on 64-bit systems.</w:t>
+            </w:r>
+          </w:p>
+        </w:tc>
+        <w:tc>
+          <w:tcPr>
+            <w:tcW w:type="dxa" w:w="2160"/>
+          </w:tcPr>
+          <w:p>
+            <w:r>
+              <w:t>scripts/CRUtil/CRU.ps1:682: $CMDletDLL = "CredRoamLVRCMDletAMD64.dll"</w:t>
+            </w:r>
+          </w:p>
+        </w:tc>
+      </w:tr>
+      <w:tr>
+        <w:tc>
+          <w:tcPr>
+            <w:tcW w:type="dxa" w:w="2160"/>
+          </w:tcPr>
+          <w:p>
+            <w:r>
+              <w:t>scripts/CRUtil/CredRoamLocalUserData.dll</w:t>
+            </w:r>
+          </w:p>
+        </w:tc>
+        <w:tc>
+          <w:tcPr>
+            <w:tcW w:type="dxa" w:w="2160"/>
+          </w:tcPr>
+          <w:p>
+            <w:r>
+              <w:t>Yes / Yes</w:t>
+            </w:r>
+          </w:p>
+        </w:tc>
+        <w:tc>
+          <w:tcPr>
+            <w:tcW w:type="dxa" w:w="2160"/>
+          </w:tcPr>
+          <w:p>
+            <w:r>
+              <w:t>Local-user credential-roaming data cmdlet, installed via install_cru.ps1 and queried via a dedicated get_complete_user_credroam_data.ps1 helper script.</w:t>
+            </w:r>
+          </w:p>
+        </w:tc>
+        <w:tc>
+          <w:tcPr>
+            <w:tcW w:type="dxa" w:w="2160"/>
+          </w:tcPr>
+          <w:p>
+            <w:r>
+              <w:t>scripts/CRUtil/install_cru.ps1:4: .\cru.ps1 -installcmdlet CredRoamLocalUserData</w:t>
+            </w:r>
+          </w:p>
+        </w:tc>
+      </w:tr>
+      <w:tr>
+        <w:tc>
+          <w:tcPr>
+            <w:tcW w:type="dxa" w:w="2160"/>
+          </w:tcPr>
+          <w:p>
+            <w:r>
+              <w:t>scripts/WinPE/Procmon24.SYS</w:t>
+            </w:r>
+          </w:p>
+        </w:tc>
+        <w:tc>
+          <w:tcPr>
+            <w:tcW w:type="dxa" w:w="2160"/>
+          </w:tcPr>
+          <w:p>
+            <w:r>
+              <w:t>Yes / Yes</w:t>
+            </w:r>
+          </w:p>
+        </w:tc>
+        <w:tc>
+          <w:tcPr>
+            <w:tcW w:type="dxa" w:w="2160"/>
+          </w:tcPr>
+          <w:p>
+            <w:r>
+              <w:t>Kernel-mode driver component of Process Monitor 24 (WinPE-specific build); TSS grants registry read/permission-read ACLs on its service instance key as part of setup.</w:t>
+            </w:r>
+          </w:p>
+        </w:tc>
+        <w:tc>
+          <w:tcPr>
+            <w:tcW w:type="dxa" w:w="2160"/>
+          </w:tcPr>
+          <w:p>
+            <w:r>
+              <w:t>TSS.ps1:4559: FwSetRegistryAcl 'HKLM:System\CurrentControlSet\Services\Procmon24\Instances\Process Monitor 24 Instance' 'Add' 'Everyone' 'Readkey' 'None' 'None' 'Allow'</w:t>
+            </w:r>
+          </w:p>
+        </w:tc>
+      </w:tr>
+    </w:tbl>
     <w:sectPr>
       <w:pgSz w:w="12240" w:h="15840"/>
       <w:pgMar w:top="1440" w:right="1800" w:bottom="1440" w:left="1800" w:header="720" w:footer="720" w:gutter="0"/>

</xml_diff>

<commit_message>
Add official-references section to report and README
Adds section 8 to the DOCX report and an "Official references" section
to README.md pointing to authoritative, first-party Microsoft sources
for TSS usage/documentation (built-in -Help/-Search, TSSGUI.ps1,
aka.ms/TssInfo, the bundled help/ directory, aka.ms/gettss) — no
third-party or community mirrors included, per request.

Co-Authored-By: Claude Sonnet 5 <noreply@anthropic.com>
Claude-Session: https://claude.ai/code/session_01MjYQcxWWR9pJZN5XKi6Ebx
</commit_message>
<xml_diff>
--- a/TSS_Security_Review.docx
+++ b/TSS_Security_Review.docx
@@ -6369,6 +6369,59 @@
         </w:tc>
       </w:tr>
     </w:tbl>
+    <w:p>
+      <w:pPr>
+        <w:pStyle w:val="Heading1"/>
+      </w:pPr>
+      <w:r>
+        <w:t>8. Official References</w:t>
+      </w:r>
+    </w:p>
+    <w:p>
+      <w:r>
+        <w:t>Sources for further reading and authoritative usage guidance on TSS, limited to official/first-party Microsoft sources — no third-party or community mirrors:</w:t>
+      </w:r>
+    </w:p>
+    <w:p>
+      <w:pPr>
+        <w:pStyle w:val="ListBullet"/>
+      </w:pPr>
+      <w:r>
+        <w:t>TSS's own built-in help — the most authoritative and complete source: run ".\TSS.ps1 -Help" or "Get-Help .\TSS.ps1 -full" after extracting the archive, or ".\TSS.ps1 -Search &lt;keyword&gt;" for topic-specific guidance. This is what was used during this review to understand TSS's own scenarios and switches.</w:t>
+      </w:r>
+    </w:p>
+    <w:p>
+      <w:pPr>
+        <w:pStyle w:val="ListBullet"/>
+      </w:pPr>
+      <w:r>
+        <w:t>TSSGUI.ps1 — the bundled GUI front-end, for browsing available scenarios/switches interactively.</w:t>
+      </w:r>
+    </w:p>
+    <w:p>
+      <w:pPr>
+        <w:pStyle w:val="ListBullet"/>
+      </w:pPr>
+      <w:r>
+        <w:t>https://aka.ms/TssInfo — Microsoft's own "Introduction to TroubleShootingScript toolset" landing page, referenced directly in TSSGUI.ps1's own help-link table.</w:t>
+      </w:r>
+    </w:p>
+    <w:p>
+      <w:pPr>
+        <w:pStyle w:val="ListBullet"/>
+      </w:pPr>
+      <w:r>
+        <w:t>The help/ directory inside the extracted archive.</w:t>
+      </w:r>
+    </w:p>
+    <w:p>
+      <w:pPr>
+        <w:pStyle w:val="ListBullet"/>
+      </w:pPr>
+      <w:r>
+        <w:t>https://aka.ms/gettss — the official Microsoft distribution short link for the toolkit itself (analyzed in section 3.1 of this report).</w:t>
+      </w:r>
+    </w:p>
     <w:sectPr>
       <w:pgSz w:w="12240" w:h="15840"/>
       <w:pgMar w:top="1440" w:right="1800" w:bottom="1440" w:left="1800" w:header="720" w:footer="720" w:gutter="0"/>

</xml_diff>